<commit_message>
Traduzione albanese completa (romanzo-sq/) e Word Romanzo_Halil_sq.docx
Co-Authored-By: Claude Opus 5.5 <noreply@anthropic.com>
Claude-Session: https://claude.ai/code/session_019vRfC4KtiW445iq8CpM3oh
</commit_message>
<xml_diff>
--- a/Romanzo_Halil_sq.docx
+++ b/Romanzo_Halil_sq.docx
@@ -3427,6 +3427,4146 @@
     <w:p>
       <w:r>
         <w:t>Atë më pas, po. Por vetëm gjysmë pëllëmbe.</w:t>
+      </w:r>
+    </w:p>
+    <w:p>
+      <w:pPr>
+        <w:sectPr>
+          <w:pgSz w:w="8391" w:h="11906"/>
+          <w:pgMar w:top="1134" w:right="1020" w:bottom="1134" w:left="1020" w:header="720" w:footer="720" w:gutter="0"/>
+          <w:cols w:space="720"/>
+          <w:docGrid w:linePitch="360"/>
+        </w:sectPr>
+      </w:pPr>
+    </w:p>
+    <w:p>
+      <w:pPr>
+        <w:spacing w:before="1200" w:after="80"/>
+        <w:ind w:firstLine="0"/>
+        <w:jc w:val="center"/>
+      </w:pPr>
+      <w:r>
+        <w:rPr>
+          <w:b w:val="0"/>
+          <w:i w:val="0"/>
+          <w:sz w:val="24"/>
+        </w:rPr>
+        <w:t>8</w:t>
+      </w:r>
+    </w:p>
+    <w:p>
+      <w:pPr>
+        <w:spacing w:before="0" w:after="600"/>
+        <w:ind w:firstLine="0"/>
+        <w:jc w:val="center"/>
+      </w:pPr>
+      <w:r>
+        <w:rPr>
+          <w:b/>
+          <w:i w:val="0"/>
+          <w:sz w:val="32"/>
+        </w:rPr>
+        <w:t>Tokë kufiri</w:t>
+      </w:r>
+    </w:p>
+    <w:p>
+      <w:pPr>
+        <w:ind w:firstLine="0"/>
+      </w:pPr>
+      <w:r>
+        <w:t>Selim Efendiu kishte një dylbi venedikase, prej bronzi dhe lëkure, dhe krenohej me të më shumë se me çdo gjë tjetër që zotëronte.</w:t>
+      </w:r>
+    </w:p>
+    <w:p>
+      <w:r>
+        <w:t>E kishte blerë në Durrës, vite më parë, nga një kapiten anijeje raguzan që kishte nevojë për para. E mbante në një kuti prej kadifeje jeshile dhe e pastronte çdo mbrëmje me një pece mëndafshi. Thoshte se një njeri që di të shohë nga larg nuk ka nevojë t'i afrohet, dhe se një njeri që nuk ka nevojë t'i afrohet nuk rrezikon kurrë.</w:t>
+      </w:r>
+    </w:p>
+    <w:p>
+      <w:r>
+        <w:t>Ishte shkruesi i pashait. Sekretari i tij, llogaritari i tij, sytë e tij. Ishte një burrë i hollë, dyzet vjeç, me mjekrën e zezë të prerë me majë, me duart e lëmuara të atij që nuk ka mbajtur kurrë shat dhe me një zë aq të ulët sa për ta dëgjuar duhej të heshtje. Nuk mbante armë. Nuk i ishin duhur kurrë.</w:t>
+      </w:r>
+    </w:p>
+    <w:p>
+      <w:r>
+        <w:t>Atë verë, pashai e thirri.</w:t>
+      </w:r>
+    </w:p>
+    <w:p>
+      <w:pPr>
+        <w:spacing w:before="200" w:after="200"/>
+        <w:ind w:firstLine="0"/>
+        <w:jc w:val="center"/>
+      </w:pPr>
+      <w:r>
+        <w:rPr>
+          <w:b w:val="0"/>
+          <w:i w:val="0"/>
+          <w:sz w:val="22"/>
+        </w:rPr>
+        <w:t>*   *   *</w:t>
+      </w:r>
+    </w:p>
+    <w:p>
+      <w:pPr>
+        <w:ind w:firstLine="0"/>
+      </w:pPr>
+      <w:r>
+        <w:t>Saraji ishte përtej Shkumbinit, tri ditë me kalë nga Kavaja, dhe nga dritaret e tij dukeshin malet. Pashai ishte një burrë i trashë, me sy të vegjël dhe duart plot unaza, që i dëgjonte të gjithë me të njëjtën shprehje të mërzitur dhe pastaj bënte gjithmonë atë që kishte vendosur që më parë.</w:t>
+      </w:r>
+    </w:p>
+    <w:p>
+      <w:r>
+        <w:t>Rrinte ulur mbi jastëkë, me çibukun e gjatë në dorë, dhe nuk e shikoi Selimin kur hyri.</w:t>
+      </w:r>
+    </w:p>
+    <w:p>
+      <w:r>
+        <w:t>«Kara Mahmudi vdiq», tha.</w:t>
+      </w:r>
+    </w:p>
+    <w:p>
+      <w:r>
+        <w:t>Selimi e dinte. E dinin të gjithë prej një viti. Pashai i madh i Shkodrës kishte vdekur duke luftuar kundër malazezëve, dhe që atëherë Shqipëria e mesme ishte si një shtëpi pa zot: të gjithë hynin, të gjithë merrnin diçka. Njerëzit e Shkodrës, ata të Beratit, ata të Tiranës, ata të Janinës. Familjet e Kavajës ishin ndarë, kush me njërin e kush me tjetrin. Taksat nuk vinin më. Fshatrat i paguanin atij që mbërrinte i pari me më shumë ushtarë.</w:t>
+      </w:r>
+    </w:p>
+    <w:p>
+      <w:r>
+        <w:t>«Fusha e Kavajës», tha pashai. «E dua.»</w:t>
+      </w:r>
+    </w:p>
+    <w:p>
+      <w:r>
+        <w:t>Selimi u përkul.</w:t>
+      </w:r>
+    </w:p>
+    <w:p>
+      <w:r>
+        <w:t>«E dua pa luftë», vazhdoi pashai, duke nxjerrë tymin. «Lufta kushton. Lufta bën zhurmë. Po të bëj zhurmë, në Stamboll e marrin vesh, dhe në Stamboll nuk u pëlqejnë pashallarët që bëjnë zhurmë. Dhe po të bëj zhurmë, ata të Shkodrës zbresin, ata të Janinës ngjiten, dhe unë gjendem në mes.» Më në fund e shikoi Selimin. «Dua që ato fshatra të vijnë tek unë vetë. Dua që të më luten t'i mbroj.»</w:t>
+      </w:r>
+    </w:p>
+    <w:p>
+      <w:r>
+        <w:t>«Fshatrat e fushës nuk i luten askujt, zotëri. Kanë frikë nga të gjithë.»</w:t>
+      </w:r>
+    </w:p>
+    <w:p>
+      <w:r>
+        <w:t>«Atëherë bëji të kenë frikë nga unë.»</w:t>
+      </w:r>
+    </w:p>
+    <w:p>
+      <w:r>
+        <w:t>Selimi heshti, duke pritur.</w:t>
+      </w:r>
+    </w:p>
+    <w:p>
+      <w:r>
+        <w:t>«Ka një zakon», tha pashai. «Te ju. Në male. Kur dy fshatra grinden për një kullotë, për një kufi, për një ujë, në vend që të vriten të gjithë, secili dërgon burrin e tij më të mirë. Luftojnë ata të dy. Kush fiton, fiton për të gjithë.»</w:t>
+      </w:r>
+    </w:p>
+    <w:p>
+      <w:r>
+        <w:t>«E njoh, zotëri.»</w:t>
+      </w:r>
+    </w:p>
+    <w:p>
+      <w:r>
+        <w:t>«Do ta përdorim atë.» Pashai buzëqeshi, me dhëmbët të verdhë nga duhani. «Fshatrat e fushës janë plot me toka pa tapi, me kufij që s'i ka shkruar kurrë njeri, me këneta që dikush i ka tharë dhe pastaj i ka marrë. Ti do të gjesh mënyrën të thuash që ato toka janë të miat. Dhe pastaj, për të qenë i drejtë, për të qenë bujar, për të mos derdhur gjak, do të propozosh zakonin e vjetër. Burri im kundër burrit të tyre. Kush fiton, mban tokën.»</w:t>
+      </w:r>
+    </w:p>
+    <w:p>
+      <w:r>
+        <w:t>«Po sikur të fitojë i tyri?»</w:t>
+      </w:r>
+    </w:p>
+    <w:p>
+      <w:r>
+        <w:t>Pashai qeshi. Një e qeshur e trashë, që ia dridhi barkun.</w:t>
+      </w:r>
+    </w:p>
+    <w:p>
+      <w:r>
+        <w:t>«Burri im është Kara Ömeri.»</w:t>
+      </w:r>
+    </w:p>
+    <w:p>
+      <w:pPr>
+        <w:spacing w:before="200" w:after="200"/>
+        <w:ind w:firstLine="0"/>
+        <w:jc w:val="center"/>
+      </w:pPr>
+      <w:r>
+        <w:rPr>
+          <w:b w:val="0"/>
+          <w:i w:val="0"/>
+          <w:sz w:val="22"/>
+        </w:rPr>
+        <w:t>*   *   *</w:t>
+      </w:r>
+    </w:p>
+    <w:p>
+      <w:pPr>
+        <w:ind w:firstLine="0"/>
+      </w:pPr>
+      <w:r>
+        <w:t>Kara Ömeri ishte një turk i Anadollit, nga një fshat afër Konjës, dhe askush nuk e dinte sa vjeç ishte. Tridhjetë, ndoshta. Dyzet. Ishte aq i madh sa dyert e sarajit dukeshin të bëra për të: kalonte duke përkulur mezi kokën. Kishte duar si lopata, mjekrën e zezë deri në gjoks dhe një zë që, kur qeshte, bënte gotat të dridheshin mbi tryezë.</w:t>
+      </w:r>
+    </w:p>
+    <w:p>
+      <w:r>
+        <w:t>Ishte pehlivani i pashait. Mundësi i tij, kampioni i tij, shfaqja e tij. Nëpër festa mundej i lyer me vaj me mundësit më të mirë të krahinës dhe i hidhte përtokë si thasë. Në mosmarrëveshje, kur duhej, merrte shpatën. Kishte bërë njëmbëdhjetë duele në jetën e tij. I kishte fituar të njëmbëdhjetë. Nga ata njëmbëdhjetë burra, nëntë kishin vdekur.</w:t>
+      </w:r>
+    </w:p>
+    <w:p>
+      <w:r>
+        <w:t>Selimi shkoi ta takonte atë mbrëmje, në oborrin pas stallave, ku Kara Ömeri stërvitej duke ngritur gurë.</w:t>
+      </w:r>
+    </w:p>
+    <w:p>
+      <w:r>
+        <w:t>«Pashai do fushën e Kavajës», tha Selimi.</w:t>
+      </w:r>
+    </w:p>
+    <w:p>
+      <w:r>
+        <w:t>Kara Ömeri e uli gurin. Ishte i madh sa një viç.</w:t>
+      </w:r>
+    </w:p>
+    <w:p>
+      <w:r>
+        <w:t>«Dhe unë ç'hyj këtu?»</w:t>
+      </w:r>
+    </w:p>
+    <w:p>
+      <w:r>
+        <w:t>«Ti do të jesh argumenti ynë.»</w:t>
+      </w:r>
+    </w:p>
+    <w:p>
+      <w:r>
+        <w:t>Kara Ömeri qeshi, dhe dallëndyshet nën çatinë e stallës fluturuan.</w:t>
+      </w:r>
+    </w:p>
+    <w:p>
+      <w:r>
+        <w:t>«Kundër kujt?»</w:t>
+      </w:r>
+    </w:p>
+    <w:p>
+      <w:r>
+        <w:t>«Nuk e di ende.» Selimi nxori kutinë prej kadifeje jeshile, e hapi, e përkëdheli dylbinë me dy gishta. «Për këtë po shkoj të shoh.»</w:t>
+      </w:r>
+    </w:p>
+    <w:p>
+      <w:pPr>
+        <w:spacing w:before="200" w:after="200"/>
+        <w:ind w:firstLine="0"/>
+        <w:jc w:val="center"/>
+      </w:pPr>
+      <w:r>
+        <w:rPr>
+          <w:b w:val="0"/>
+          <w:i w:val="0"/>
+          <w:sz w:val="22"/>
+        </w:rPr>
+        <w:t>*   *   *</w:t>
+      </w:r>
+    </w:p>
+    <w:p>
+      <w:pPr>
+        <w:ind w:firstLine="0"/>
+      </w:pPr>
+      <w:r>
+        <w:t>U nis një javë më vonë, vetëm, me një shërbëtor dhe dy kuaj, i veshur si tregtar.</w:t>
+      </w:r>
+    </w:p>
+    <w:p>
+      <w:r>
+        <w:t>E përshkoi fushën e Kavajës gjithë verën. Ndalej nëpër fshatra, blinte vaj, lesh, djathë. Pinte kafe me pleqtë nën pemët e shesheve. Dëgjonte. Nuk bënte kurrë pyetje të drejtpërdrejta: i linte njerëzit të flisnin, dhe njerëzit flisnin gjithmonë, sidomos me një të huaj të sjellshëm që paguante mirë dhe nuk nxitonte.</w:t>
+      </w:r>
+    </w:p>
+    <w:p>
+      <w:r>
+        <w:t>Pyeste për të korrat, për taksat, për kufijtë. Pyeste për familjet, kush ishte i afërm me kë, kush ishte grindur me kë. Dhe pastaj, gati rastësisht, në fund, kur kafeja kishte mbaruar dhe pleqtë ngriheshin, pyeste: po këtu te ju, kush është më i forti?</w:t>
+      </w:r>
+    </w:p>
+    <w:p>
+      <w:r>
+        <w:t>Përgjigjet ishin të shumta. Në një fshat ishte i biri i mullixhiut, që ngrinte një gomar. Në një tjetër ishte një bari nga malet që kishte zbritur për dimër, që kishte vrarë një ujk me duar. Në një tjetër akoma ishte një plak që nuk luftonte më, por që si i ri, thoshin, e kishte bërë gjysmën e Shqipërisë të dridhej.</w:t>
+      </w:r>
+    </w:p>
+    <w:p>
+      <w:r>
+        <w:t>Selimi dëgjonte, pohonte me kokë, shkruante në mbrëmje në fletoren e tij, me shkrimin e tij të imët dhe të rregullt.</w:t>
+      </w:r>
+    </w:p>
+    <w:p>
+      <w:r>
+        <w:t>Pastaj, në fund të gushtit, arriti në një fshat në kodrat mbi fushë. Një fshat i vogël, me shtëpi gri mes ullinjve, me një xhami të bardhë dhe një vidh të madh në shesh dhe, poshtë, drejt përroit, një arë me grurë të zi e të yndyrshëm që dikur, i thanë, kishte qenë kënetë.</w:t>
+      </w:r>
+    </w:p>
+    <w:p>
+      <w:r>
+        <w:t>Quhej Leshtej.</w:t>
+      </w:r>
+    </w:p>
+    <w:p>
+      <w:r>
+        <w:t>Piu kafe me pleqtë nën vidh. Bëri pyetjet e tij për të korrat, për taksat, për kufijtë. Pastaj, në fund, gati rastësisht, bëri të fundit.</w:t>
+      </w:r>
+    </w:p>
+    <w:p>
+      <w:r>
+        <w:t>Po këtu te ju, kush është më i forti?</w:t>
+      </w:r>
+    </w:p>
+    <w:p>
+      <w:r>
+        <w:t>Kësaj radhe përgjigjja ishte vetëm një. E dhanë të gjithë bashkë, pleqtë, burrat e ulur përreth, madje edhe një çunak që kalonte me një dhi. E dhanë pa menduar, siç thuhet emri i diellit.</w:t>
+      </w:r>
+    </w:p>
+    <w:p>
+      <w:r>
+        <w:t>«Halili.»</w:t>
+      </w:r>
+    </w:p>
+    <w:p>
+      <w:r>
+        <w:t>Selim Efendiu buzëqeshi, dhe e shkroi emrin në fletoren e tij.</w:t>
+      </w:r>
+    </w:p>
+    <w:p>
+      <w:pPr>
+        <w:sectPr>
+          <w:pgSz w:w="8391" w:h="11906"/>
+          <w:pgMar w:top="1134" w:right="1020" w:bottom="1134" w:left="1020" w:header="720" w:footer="720" w:gutter="0"/>
+          <w:cols w:space="720"/>
+          <w:docGrid w:linePitch="360"/>
+        </w:sectPr>
+      </w:pPr>
+    </w:p>
+    <w:p>
+      <w:pPr>
+        <w:spacing w:before="1200" w:after="80"/>
+        <w:ind w:firstLine="0"/>
+        <w:jc w:val="center"/>
+      </w:pPr>
+      <w:r>
+        <w:rPr>
+          <w:b w:val="0"/>
+          <w:i w:val="0"/>
+          <w:sz w:val="24"/>
+        </w:rPr>
+        <w:t>9</w:t>
+      </w:r>
+    </w:p>
+    <w:p>
+      <w:pPr>
+        <w:spacing w:before="0" w:after="600"/>
+        <w:ind w:firstLine="0"/>
+        <w:jc w:val="center"/>
+      </w:pPr>
+      <w:r>
+        <w:rPr>
+          <w:b/>
+          <w:i w:val="0"/>
+          <w:sz w:val="32"/>
+        </w:rPr>
+        <w:t>Viçi</w:t>
+      </w:r>
+    </w:p>
+    <w:p>
+      <w:pPr>
+        <w:ind w:firstLine="0"/>
+      </w:pPr>
+      <w:r>
+        <w:t>Bajrami martohej në shtator, dhe Shabani kishte një ide.</w:t>
+      </w:r>
+    </w:p>
+    <w:p>
+      <w:r>
+        <w:t>Shabani kishte gjithmonë një ide, por kjo, thoshte ai, ishte më e mira e jetës së tij. E shpjegoi nën vidh, dy ditë para dasmës, para gjysmës së fshatit, me duart që vizatonin në ajër.</w:t>
+      </w:r>
+    </w:p>
+    <w:p>
+      <w:r>
+        <w:t>«Një garë», tha. «Një garë force. Si në kohën e gjyshit tim. Një gjë që njerëzit ta mbajnë mend për njëqind vjet.»</w:t>
+      </w:r>
+    </w:p>
+    <w:p>
+      <w:r>
+        <w:t>«Çfarë gare?» pyeti dikush.</w:t>
+      </w:r>
+    </w:p>
+    <w:p>
+      <w:r>
+        <w:t>Shabani vështroi përreth, për t'u siguruar që po dëgjonin të gjithë. Pastaj ngriti një dorë, të mbyllur grusht, dhe nxori prej saj vetëm një gisht. Gishtin e vogël.</w:t>
+      </w:r>
+    </w:p>
+    <w:p>
+      <w:r>
+        <w:t>«Viçi», tha. «Një litar. Një nyjë. Nyja rreth gishtit të vogël. Dhe viçi ngrihet nga toka. Kush ia del, fiton.»</w:t>
+      </w:r>
+    </w:p>
+    <w:p>
+      <w:r>
+        <w:t>Pati një çast heshtjeje. Pastaj të gjithë filluan të flasin njëherësh.</w:t>
+      </w:r>
+    </w:p>
+    <w:p>
+      <w:r>
+        <w:t>«S'ka mundësi!»</w:t>
+      </w:r>
+    </w:p>
+    <w:p>
+      <w:r>
+        <w:t>«Të këputet gishti!»</w:t>
+      </w:r>
+    </w:p>
+    <w:p>
+      <w:r>
+        <w:t>«Viç sa muajsh?»</w:t>
+      </w:r>
+    </w:p>
+    <w:p>
+      <w:r>
+        <w:t>«Gjyshi im e bënte», tha Shabani, me pamje të fyer. «Gjyshi im ngrinte një viç gjashtëmujor me gishtin e vogël dhe pastaj pinte përsipër një shtambë raki.»</w:t>
+      </w:r>
+    </w:p>
+    <w:p>
+      <w:r>
+        <w:t>«Gjyshi yt ishte gënjeshtar si ti», tha Zeneli, dhe qeshën të gjithë.</w:t>
+      </w:r>
+    </w:p>
+    <w:p>
+      <w:r>
+        <w:t>Por gara u bë.</w:t>
+      </w:r>
+    </w:p>
+    <w:p>
+      <w:pPr>
+        <w:spacing w:before="200" w:after="200"/>
+        <w:ind w:firstLine="0"/>
+        <w:jc w:val="center"/>
+      </w:pPr>
+      <w:r>
+        <w:rPr>
+          <w:b w:val="0"/>
+          <w:i w:val="0"/>
+          <w:sz w:val="22"/>
+        </w:rPr>
+        <w:t>*   *   *</w:t>
+      </w:r>
+    </w:p>
+    <w:p>
+      <w:pPr>
+        <w:ind w:firstLine="0"/>
+      </w:pPr>
+      <w:r>
+        <w:t>Dasma e Bajramit ishte ndryshe nga ajo e Halilit. Më e vogël, më e gëzuar, me më pak të afërm dhe më shumë verë. Nusja ishte një vajzë nga Helmësi, e rrumbullakët dhe e qeshur, që Bajrami e kishte njohur në pazarin e Kavajës dhe për të cilën kishte humbur mendjen brenda një pasditeje. U kërcye në lëmin e Rexhepit, si pesë vjet më parë. Rexhepi, kësaj radhe, as nuk u ngrit: duartrokiste ulur, nën man, me Fatimenë pranë.</w:t>
+      </w:r>
+    </w:p>
+    <w:p>
+      <w:r>
+        <w:t>Ditën e dytë, pasdite, Shabani solli viçin.</w:t>
+      </w:r>
+    </w:p>
+    <w:p>
+      <w:r>
+        <w:t>Ishte një viç i kuq, pesë a gjashtë muajsh, i madh, me brirët që po i dilnin, që nuk kishte asnjë dëshirë të ishte aty dhe ua bënte të qartë të gjithëve. Shabani e lidhi pas shtyllës në mes të lëmit, i mbështolli një litar rreth barkut, pas këmbëve të para, dhe bëri një nyjë mbi shpinë. Pastaj mori anën tjetër të litarit dhe i bëri një lak të vogël, sa për një gisht.</w:t>
+      </w:r>
+    </w:p>
+    <w:p>
+      <w:r>
+        <w:t>«Kush fillon?»</w:t>
+      </w:r>
+    </w:p>
+    <w:p>
+      <w:r>
+        <w:t>Filloi i biri i mullixhiut, i vëllai i Qamilit, që si djalë ngrinte një gomar. E futi gishtin e vogël në lak, nguli këmbët, tërhoqi. Viçi pëlliti. I biri i mullixhiut u skuq, pastaj u nxi. Viçi nuk lëvizi. Pas një çasti i biri i mullixhiut e lëshoi, me një britmë, dhe e shtrëngoi gishtin pas gjoksit. Qeshën të gjithë.</w:t>
+      </w:r>
+    </w:p>
+    <w:p>
+      <w:r>
+        <w:t>Provuan gjashtë. Asnjë nuk ia doli. Njërit iu ndrydh gishti dhe iu desh të shkonte te Zylo t'ia vinte në vend. Një tjetër arriti ta ngrinte viçin një pëllëmbë, për një çast, dhe të gjithë bërtitën, por këmbët e pasme nuk ishin shkëputur nga toka dhe Shabani tha që nuk vlente.</w:t>
+      </w:r>
+    </w:p>
+    <w:p>
+      <w:r>
+        <w:t>Ramadani nuk provoi. U ul mbi mur me këmbën e tij të çalë, të shikonte, dhe herë pas here shikonte Halilin.</w:t>
+      </w:r>
+    </w:p>
+    <w:p>
+      <w:r>
+        <w:t>Në fund të gjithë po shikonin Halilin.</w:t>
+      </w:r>
+    </w:p>
+    <w:p>
+      <w:pPr>
+        <w:spacing w:before="200" w:after="200"/>
+        <w:ind w:firstLine="0"/>
+        <w:jc w:val="center"/>
+      </w:pPr>
+      <w:r>
+        <w:rPr>
+          <w:b w:val="0"/>
+          <w:i w:val="0"/>
+          <w:sz w:val="22"/>
+        </w:rPr>
+        <w:t>*   *   *</w:t>
+      </w:r>
+    </w:p>
+    <w:p>
+      <w:pPr>
+        <w:ind w:firstLine="0"/>
+      </w:pPr>
+      <w:r>
+        <w:t>Nga kodra përballë, gjysmë mile larg, dikush tjetër shikonte.</w:t>
+      </w:r>
+    </w:p>
+    <w:p>
+      <w:r>
+        <w:t>Selim Efendiu ishte nisur nga Leshteji tri ditë më parë, me kuajt e tij dhe shërbëtorin e tij dhe vajin e tij dhe leshin e tij, duke përshëndetur të gjithë. Ishte kthyer natën, vetëm, dhe ishte vendosur mes shkëmbinjve të kodrës që ishte përballë fshatit, përtej përroit, ku rritej një korije me ilqe. Prej andej dukej gjithçka: shtëpitë, sheshi, xhamia, lëmi i Rexhepit.</w:t>
+      </w:r>
+    </w:p>
+    <w:p>
+      <w:r>
+        <w:t>E kishte dëgjuar për garën nën vidh. Kishte vendosur ta shihte.</w:t>
+      </w:r>
+    </w:p>
+    <w:p>
+      <w:r>
+        <w:t>Por nuk donte ta shihte nga afër. Pas disa muajsh do të kthehej në Leshtej, dhe jo më si tregtar i sjellshëm. Do të kthehej me Kara Ömerin, dhe me ushtarët, dhe me një fletë të pashait. Nuk donte që njeri t'ia mbante mend fytyrën.</w:t>
+      </w:r>
+    </w:p>
+    <w:p>
+      <w:r>
+        <w:t>Për këtë ishte dylbia.</w:t>
+      </w:r>
+    </w:p>
+    <w:p>
+      <w:r>
+        <w:t>E nxori nga kutia prej kadifeje jeshile, e zgjati, mbështeti bërrylin mbi një shkëmb dhe e çoi okularin te syri. Bota u ngushtua në një rreth drite. Brenda rrethit ishte lëmi, i vogël dhe i largët, dhe njerëzit ishin figura me ngjyra. Selimi rrotulloi unazën derisa figurat u qartësuan. Tani shihte fytyrat.</w:t>
+      </w:r>
+    </w:p>
+    <w:p>
+      <w:r>
+        <w:t>Pa viçin e kuq të lidhur pas shtyllës. Pa burrat përreth. Pa të trashin me mustaqe, atë që e kishte shpikur garën, që fliste dhe tundte duart. Pa një burrë të gjatë që ngrihej nga poshtë manit dhe vinte përpara.</w:t>
+      </w:r>
+    </w:p>
+    <w:p>
+      <w:r>
+        <w:t>E njohu. E kishte parë disa herë ato ditë, nga larg, nëpër ara. Nuk i kishte folur kurrë. Kishte pyetur për të, me kujdes, dhe i kishin treguar gjithçka: luftën, Rymnikun, Izmailin, robërinë, kënetën e tharë.</w:t>
+      </w:r>
+    </w:p>
+    <w:p>
+      <w:r>
+        <w:t>Halili.</w:t>
+      </w:r>
+    </w:p>
+    <w:p>
+      <w:r>
+        <w:t>Selimi mbajti frymën dhe shikoi.</w:t>
+      </w:r>
+    </w:p>
+    <w:p>
+      <w:pPr>
+        <w:spacing w:before="200" w:after="200"/>
+        <w:ind w:firstLine="0"/>
+        <w:jc w:val="center"/>
+      </w:pPr>
+      <w:r>
+        <w:rPr>
+          <w:b w:val="0"/>
+          <w:i w:val="0"/>
+          <w:sz w:val="22"/>
+        </w:rPr>
+        <w:t>*   *   *</w:t>
+      </w:r>
+    </w:p>
+    <w:p>
+      <w:pPr>
+        <w:ind w:firstLine="0"/>
+      </w:pPr>
+      <w:r>
+        <w:t>Halili u ndal para viçit.</w:t>
+      </w:r>
+    </w:p>
+    <w:p>
+      <w:r>
+        <w:t>E shikoi. Viçi e shikoi, me sytë e mëdhenj e të lagur, dhe pushoi së pëllituri. Halili i vuri një dorë në qafë. Mbeti kështu një çast, sikur t'i fliste. Pastaj mori lakun e litarit.</w:t>
+      </w:r>
+    </w:p>
+    <w:p>
+      <w:r>
+        <w:t>Vështroi përreth. Shikoi njerëzit, gjithë fshatin të mbledhur rreth lëmit. Shikoi Ramadanin mbi mur. Shikoi Hatixhenë, në këmbë mes grave, me duart të kryqëzuara mbi bark, që ishte mezi-mezi më i rrumbullakët se më parë.</w:t>
+      </w:r>
+    </w:p>
+    <w:p>
+      <w:r>
+        <w:t>Pastaj e futi lakun në gishtin e vogël të dorës së djathtë.</w:t>
+      </w:r>
+    </w:p>
+    <w:p>
+      <w:r>
+        <w:t>Ramadani, mbi mur, uli sytë. Askush nuk e vuri re.</w:t>
+      </w:r>
+    </w:p>
+    <w:p>
+      <w:r>
+        <w:t>Halili nguli këmbët. Përkuli gjunjët. E mbështolli litarin rreth gishtave të tjerë, që të mos ia priste mishin, duke e lënë nyjën mbi gishtin e vogël siç e donte rregulli. Krahu i djathtë u tendos. Venat e qafës iu fryn si litarë.</w:t>
+      </w:r>
+    </w:p>
+    <w:p>
+      <w:r>
+        <w:t>Tërhoqi.</w:t>
+      </w:r>
+    </w:p>
+    <w:p>
+      <w:r>
+        <w:t>Për një çast nuk ndodhi asgjë. Viçi mbeti me të katër këmbët në tokë. Dikush, mes turmës, e mbajti frymën aq fort sa u dëgjua.</w:t>
+      </w:r>
+    </w:p>
+    <w:p>
+      <w:r>
+        <w:t>Pastaj këmbët e para u shkëputën nga toka.</w:t>
+      </w:r>
+    </w:p>
+    <w:p>
+      <w:r>
+        <w:t>Pastaj, ngadalë, gisht pas gishti, këmbët e pasme.</w:t>
+      </w:r>
+    </w:p>
+    <w:p>
+      <w:r>
+        <w:t>Viçi i kuq, pesë a gjashtë muajsh, me brirët që po i dilnin, mbeti pezull një pëllëmbë mbi tokë, i varur në gishtin e vogël të djathtë të Halilit, me litarin të tendosur si tel lahute. Pëlliste, shqelmonte, rrotullohej rreth vetes. Halili nuk lëvizte. Kishte fytyrën e qetë, gati të zhytur në mendime, sikur po mendonte diçka tjetër.</w:t>
+      </w:r>
+    </w:p>
+    <w:p>
+      <w:r>
+        <w:t>Numëroi deri në pesë, me zë të lartë. Pastaj e vuri viçin përtokë, ngadalë, siç vihet një gjë që mund të thyhet.</w:t>
+      </w:r>
+    </w:p>
+    <w:p>
+      <w:r>
+        <w:t>Për një çast pati heshtje.</w:t>
+      </w:r>
+    </w:p>
+    <w:p>
+      <w:r>
+        <w:t>Pastaj lëmi shpërtheu.</w:t>
+      </w:r>
+    </w:p>
+    <w:p>
+      <w:pPr>
+        <w:spacing w:before="200" w:after="200"/>
+        <w:ind w:firstLine="0"/>
+        <w:jc w:val="center"/>
+      </w:pPr>
+      <w:r>
+        <w:rPr>
+          <w:b w:val="0"/>
+          <w:i w:val="0"/>
+          <w:sz w:val="22"/>
+        </w:rPr>
+        <w:t>*   *   *</w:t>
+      </w:r>
+    </w:p>
+    <w:p>
+      <w:pPr>
+        <w:ind w:firstLine="0"/>
+      </w:pPr>
+      <w:r>
+        <w:t>Mbi kodër, mes ilqeve, Selim Efendiu e uli dylbinë.</w:t>
+      </w:r>
+    </w:p>
+    <w:p>
+      <w:r>
+        <w:t>I djersinin duart. I fshiu gishtat pas kaftanit, me kujdes, dhe e vuri dylbinë në kutinë e saj prej kadifeje jeshile. Pastaj nxori fletoren dhe lapsin prej plumbi.</w:t>
+      </w:r>
+    </w:p>
+    <w:p>
+      <w:r>
+        <w:t>Poshtë emrit që kishte shkruar nën vidh, dy javë më parë, shtoi një rresht, me shkrimin e tij të imët dhe të rregullt.</w:t>
+      </w:r>
+    </w:p>
+    <w:p>
+      <w:r>
+        <w:rPr>
+          <w:i/>
+        </w:rPr>
+        <w:t>E djathta. Një gisht i vogël i së djathtës që ngre një viç. Krahu i djathtë është gjithçka.</w:t>
+      </w:r>
+    </w:p>
+    <w:p>
+      <w:r>
+        <w:t>E mbylli fletoren.</w:t>
+      </w:r>
+    </w:p>
+    <w:p>
+      <w:r>
+        <w:t>Poshtë, në fshat, njerëzit kërcenin rreth Halilit, dhe Shabani bërtiste që i gjyshi ishte gënjeshtar por që tani, për Zotin, ishte bërë e vërtetë, dhe Bajrami përqafonte të vëllanë, dhe viçi i kuq, i çliruar nga litari, vraponte në rreth nëpër lëmë duke trembur fëmijët.</w:t>
+      </w:r>
+    </w:p>
+    <w:p>
+      <w:r>
+        <w:t>Selimi u ngrit. Pastroi gjunjët. Shikoi për herë të fundit fshatin.</w:t>
+      </w:r>
+    </w:p>
+    <w:p>
+      <w:r>
+        <w:t>Pastaj zbriti nga ana tjetër e kodrës, ku e priste kali.</w:t>
+      </w:r>
+    </w:p>
+    <w:p>
+      <w:pPr>
+        <w:sectPr>
+          <w:pgSz w:w="8391" w:h="11906"/>
+          <w:pgMar w:top="1134" w:right="1020" w:bottom="1134" w:left="1020" w:header="720" w:footer="720" w:gutter="0"/>
+          <w:cols w:space="720"/>
+          <w:docGrid w:linePitch="360"/>
+        </w:sectPr>
+      </w:pPr>
+    </w:p>
+    <w:p>
+      <w:pPr>
+        <w:spacing w:before="1200" w:after="80"/>
+        <w:ind w:firstLine="0"/>
+        <w:jc w:val="center"/>
+      </w:pPr>
+      <w:r>
+        <w:rPr>
+          <w:b w:val="0"/>
+          <w:i w:val="0"/>
+          <w:sz w:val="24"/>
+        </w:rPr>
+        <w:t>10</w:t>
+      </w:r>
+    </w:p>
+    <w:p>
+      <w:pPr>
+        <w:spacing w:before="0" w:after="600"/>
+        <w:ind w:firstLine="0"/>
+        <w:jc w:val="center"/>
+      </w:pPr>
+      <w:r>
+        <w:rPr>
+          <w:b/>
+          <w:i w:val="0"/>
+          <w:sz w:val="32"/>
+        </w:rPr>
+        <w:t>Dora e fortë</w:t>
+      </w:r>
+    </w:p>
+    <w:p>
+      <w:pPr>
+        <w:ind w:firstLine="0"/>
+      </w:pPr>
+      <w:r>
+        <w:t>Kara Ömeri e dëgjoi tregimin e viçit dhe qeshi.</w:t>
+      </w:r>
+    </w:p>
+    <w:p>
+      <w:r>
+        <w:t>Ishin në oborrin pas stallave, në perëndim. Kampioni ishte ulur mbi një gur, lakuriq nga brezi e lart, me lëkurën që shkëlqente nga vaji pas mundjes së pasdites. Selimi rrinte në këmbë para tij, me fletoren në dorë.</w:t>
+      </w:r>
+    </w:p>
+    <w:p>
+      <w:r>
+        <w:t>«Një viç», tha Kara Ömeri. «Me gishtin e vogël.»</w:t>
+      </w:r>
+    </w:p>
+    <w:p>
+      <w:r>
+        <w:t>«Pesë a gjashtë muajsh. E pashë me sytë e mi.»</w:t>
+      </w:r>
+    </w:p>
+    <w:p>
+      <w:r>
+        <w:t>«Me dylbi.»</w:t>
+      </w:r>
+    </w:p>
+    <w:p>
+      <w:r>
+        <w:t>«Me dylbi.»</w:t>
+      </w:r>
+    </w:p>
+    <w:p>
+      <w:r>
+        <w:t>Kara Ömeri pushoi së qeshuri. Zgjati dorën e djathtë, të madhe si lopatë, dhe e shikoi. Përkuli gishtin e vogël, e drejtoi, e përkuli përsëri.</w:t>
+      </w:r>
+    </w:p>
+    <w:p>
+      <w:r>
+        <w:t>«Unë një viç me gishtin e vogël nuk e kam ngritur kurrë», tha. «Nuk kam provuar kurrë.»</w:t>
+      </w:r>
+    </w:p>
+    <w:p>
+      <w:r>
+        <w:t>«Nuk ta kërkoj.»</w:t>
+      </w:r>
+    </w:p>
+    <w:p>
+      <w:r>
+        <w:t>«Çfarë më kërkon, atëherë?»</w:t>
+      </w:r>
+    </w:p>
+    <w:p>
+      <w:r>
+        <w:t>Selimi e mbylli fletoren.</w:t>
+      </w:r>
+    </w:p>
+    <w:p>
+      <w:r>
+        <w:t>«Asgjë. Të them atë që pashë. Një burrë i fortë si ti, ndoshta më shumë. Më i ri. Që ka bërë dy luftëra dhe i ka kaluar të dyja në rreshtin e parë. Që në Izmail, thonë, vrau tre grenadierë rusë i vetëm për të shpëtuar një shok. Që në fshat e thërrasin me emër siç thërritet dielli.»</w:t>
+      </w:r>
+    </w:p>
+    <w:p>
+      <w:r>
+        <w:t>Kara Ömeri e shikoi gjatë.</w:t>
+      </w:r>
+    </w:p>
+    <w:p>
+      <w:r>
+        <w:t>«Ke frikë se do të humbas.»</w:t>
+      </w:r>
+    </w:p>
+    <w:p>
+      <w:r>
+        <w:t>«Nuk kam frikë nga asgjë. Bëj llogari.»</w:t>
+      </w:r>
+    </w:p>
+    <w:p>
+      <w:r>
+        <w:t>«Kam bërë njëmbëdhjetë duele.»</w:t>
+      </w:r>
+    </w:p>
+    <w:p>
+      <w:r>
+        <w:t>«E di. Të gjitha kundër burrave që kishin frikë nga ti.» Selimi u ul mbi një gur tjetër, përballë kampionit, dhe foli më ngadalë, aq ngadalë sa Kara Ömerit iu desh të përkulej për ta dëgjuar. «Ky burrë nuk do të ketë frikë nga ti. E pashë si e shikonte viçin. Nuk ka frikë nga asgjë.»</w:t>
+      </w:r>
+    </w:p>
+    <w:p>
+      <w:r>
+        <w:t>Kara Ömeri nuk tha asgjë. Kaloi dorën mbi mjekër, ngadalë.</w:t>
+      </w:r>
+    </w:p>
+    <w:p>
+      <w:r>
+        <w:t>«Pashai do fushën», tha Selimi. «Po të humbësh, pashai humb fushën, dhe Leshteji bëhet këngë. Të gjitha fshatrat e Kavajës do ta këndojnë. Fshati që mundi kampionin e pashait. Dhe pashai nuk do të mund të dërgojë më njeri të kërkojë asgjë, sepse do ta presin me gurë.» Bëri një pauzë. «Dhe ti, Ömer, do të kthehesh të mundesh nëpër festa i lyer me vaj. Po të shkojë mirë.»</w:t>
+      </w:r>
+    </w:p>
+    <w:p>
+      <w:r>
+        <w:t>Kampioni u ngrit. Ishte një vigan kundër qiellit të kuq.</w:t>
+      </w:r>
+    </w:p>
+    <w:p>
+      <w:r>
+        <w:t>«Atëherë çfarë do?»</w:t>
+      </w:r>
+    </w:p>
+    <w:p>
+      <w:r>
+        <w:t>«Dua që të fitosh», tha Selimi. «Gjithmonë. Me siguri. Pa rrezik.»</w:t>
+      </w:r>
+    </w:p>
+    <w:p>
+      <w:pPr>
+        <w:spacing w:before="200" w:after="200"/>
+        <w:ind w:firstLine="0"/>
+        <w:jc w:val="center"/>
+      </w:pPr>
+      <w:r>
+        <w:rPr>
+          <w:b w:val="0"/>
+          <w:i w:val="0"/>
+          <w:sz w:val="22"/>
+        </w:rPr>
+        <w:t>*   *   *</w:t>
+      </w:r>
+    </w:p>
+    <w:p>
+      <w:pPr>
+        <w:ind w:firstLine="0"/>
+      </w:pPr>
+      <w:r>
+        <w:t>Pashai nuk deshi t'i dinte hollësitë.</w:t>
+      </w:r>
+    </w:p>
+    <w:p>
+      <w:r>
+        <w:t>Selimi ia tha në mënyrë që të mos i duhej t'i dinte. I tha se kampioni i Leshtejit ishte i fortë, se kishte një rrezik, se ai, Selimi, do të gjente mënyrën ta mënjanonte. Pashai e dëgjoi me shprehjen e tij të mërzitur, duke pirë duhan.</w:t>
+      </w:r>
+    </w:p>
+    <w:p>
+      <w:r>
+        <w:t>«Kisha thënë pa gjak», tha në fund.</w:t>
+      </w:r>
+    </w:p>
+    <w:p>
+      <w:r>
+        <w:t>«Pa gjak për fshatrat, zotëri. Pa luftë. Pa zhurmë. Askush në Stamboll nuk do të marrë vesh asgjë.» Selimi u përkul. «Një njeri i vetëm nuk është luftë. Një njeri i vetëm është një aksident.»</w:t>
+      </w:r>
+    </w:p>
+    <w:p>
+      <w:r>
+        <w:t>Pashai nxori tymin.</w:t>
+      </w:r>
+    </w:p>
+    <w:p>
+      <w:r>
+        <w:t>«Nuk dua të vdesë», tha. «Po të vdesë para duelit, në fshat do të gjejnë një tjetër, dhe do të thonë që e vrava unë. Do ta bëjnë shenjtor.» E shikoi Selimin me sytë e tij të vegjël. «Dua që të vijë në duel. Dua që fshati ta shohë të humbasë. Para të gjithëve. Kështu nuk do të ketë më shenjtorë, dhe nuk do të ketë më këngë.»</w:t>
+      </w:r>
+    </w:p>
+    <w:p>
+      <w:r>
+        <w:t>Selimi mendoi.</w:t>
+      </w:r>
+    </w:p>
+    <w:p>
+      <w:r>
+        <w:t>Mendoi dylbinë. Rrethin e dritës. Gishtin e vogël që ngrinte një viç. Krahun e djathtë të tendosur si tel lahute.</w:t>
+      </w:r>
+    </w:p>
+    <w:p>
+      <w:r>
+        <w:t>«Do të vijë në duel», tha. «Por jo me atë dorë.»</w:t>
+      </w:r>
+    </w:p>
+    <w:p>
+      <w:pPr>
+        <w:spacing w:before="200" w:after="200"/>
+        <w:ind w:firstLine="0"/>
+        <w:jc w:val="center"/>
+      </w:pPr>
+      <w:r>
+        <w:rPr>
+          <w:b w:val="0"/>
+          <w:i w:val="0"/>
+          <w:sz w:val="22"/>
+        </w:rPr>
+        <w:t>*   *   *</w:t>
+      </w:r>
+    </w:p>
+    <w:p>
+      <w:pPr>
+        <w:ind w:firstLine="0"/>
+      </w:pPr>
+      <w:r>
+        <w:t>Burri quhej Hysen, dhe e thërrisnin i Ziu, për lëkurën e pjekur nga dielli dhe për gjëra të tjera.</w:t>
+      </w:r>
+    </w:p>
+    <w:p>
+      <w:r>
+        <w:t>Vinte nga Mallakastra, nga kodrat mbi Fier, ku burrat mësonin të hidhnin shtizën para se të mësonin të shkruanin emrin e tyre. Shkonte për derra të egër me shtizë, vetëm, pa qen, dhe njerëzit thoshin se nuk kishte gabuar kurrë një goditje. I shitej kujtdo që paguante. Kishte punuar për bejlerët e Beratit, për ata të Vlorës, për këdo që kishte nevojë për diçka që nuk mund të kërkohej me zë të lartë.</w:t>
+      </w:r>
+    </w:p>
+    <w:p>
+      <w:r>
+        <w:t>Selimi e takoi në një han në Lushnjë, natën, në një dhomë në anën e pasme, me vetëm një qiri mbi tryezë.</w:t>
+      </w:r>
+    </w:p>
+    <w:p>
+      <w:r>
+        <w:t>Hyseni ishte i vogël dhe i thatë, me duar të holla dhe sy të çelët, gati të verdhë, si të maces. E kishte mbështetur pas murit shtizën e tij: një shtizë prej frashëri e gjatë një herë e gjysmë sa një burrë dhe një majë e gjerë, prej hekuri të farkëtuar, e gjatë sa një parakrah, me buzët të mprehura si brisk.</w:t>
+      </w:r>
+    </w:p>
+    <w:p>
+      <w:r>
+        <w:t>«Nuk e dua të vdekur», tha Selimi.</w:t>
+      </w:r>
+    </w:p>
+    <w:p>
+      <w:r>
+        <w:t>«Kushton më shumë.»</w:t>
+      </w:r>
+    </w:p>
+    <w:p>
+      <w:r>
+        <w:t>«E di.»</w:t>
+      </w:r>
+    </w:p>
+    <w:p>
+      <w:r>
+        <w:t>«I vdekur është e lehtë. Një goditje në shpinë dhe natën e mirë.» Hyseni hodhi raki në gotë. «I gjallë, dhe jashtë loje, është punë e hollë.»</w:t>
+      </w:r>
+    </w:p>
+    <w:p>
+      <w:r>
+        <w:t>«Dua dorën e djathtë.»</w:t>
+      </w:r>
+    </w:p>
+    <w:p>
+      <w:r>
+        <w:t>Hyseni ngriti sytë e verdhë nga gota.</w:t>
+      </w:r>
+    </w:p>
+    <w:p>
+      <w:r>
+        <w:t>«Dorën», përsëriti.</w:t>
+      </w:r>
+    </w:p>
+    <w:p>
+      <w:r>
+        <w:t>«Dorën e djathtë. Ose krahun. Aq sa të mos mund të mbajë më shpatë.» Selimi vuri mbi tryezë një qese lëkure. Tingëlloi. «Pastaj duhet të shërohet. Duhet të qëndrojë në këmbë. Duhet të mund të ecë deri në shesh.»</w:t>
+      </w:r>
+    </w:p>
+    <w:p>
+      <w:r>
+        <w:t>Hyseni e peshoi qesen. Nuk e hapi.</w:t>
+      </w:r>
+    </w:p>
+    <w:p>
+      <w:r>
+        <w:t>«Një herë i kam prerë këmbën një derri të egër në vrap», tha. «Nga tridhjetë hapa. Një dorë e palëvizur është më e lehtë se një këmbë që vrapon.»</w:t>
+      </w:r>
+    </w:p>
+    <w:p>
+      <w:r>
+        <w:t>«E palëvizur nuk do të jetë.»</w:t>
+      </w:r>
+    </w:p>
+    <w:p>
+      <w:r>
+        <w:t>«E palëvizur apo jo.» Hyseni e futi qesen në brez. «Ku e gjej?»</w:t>
+      </w:r>
+    </w:p>
+    <w:p>
+      <w:r>
+        <w:t>Selimi hapi fletoren. Aty ishte gjithçka: zakonet, oraret, shtigjet. Mulliri në përrua ku Halili çonte grurin çdo javë. Rruga që bënte në perëndim, vetëm, për t'u kthyer nga ara e re në fushë. Kallamishtja përgjatë kanalit që e kishte gërmuar me duart e tij, ku kallamat ishin më të lartë se një burrë.</w:t>
+      </w:r>
+    </w:p>
+    <w:p>
+      <w:r>
+        <w:t>Hyseni i lexoi të gjitha, në dritën e qiririt, duke lëvizur buzët.</w:t>
+      </w:r>
+    </w:p>
+    <w:p>
+      <w:r>
+        <w:t>«Kallamishtja», tha në fund. «Në perëndim. Me diellin pas shpinës sime dhe në sytë e tij.»</w:t>
+      </w:r>
+    </w:p>
+    <w:p>
+      <w:r>
+        <w:t>Selimi pohoi me kokë.</w:t>
+      </w:r>
+    </w:p>
+    <w:p>
+      <w:r>
+        <w:t>Hyseni u ngrit, mori shtizën, u ndal te dera.</w:t>
+      </w:r>
+    </w:p>
+    <w:p>
+      <w:r>
+        <w:t>«Po sikur të kthehet nga ana e gabuar?» pyeti. «Sikur të ngrejë të majtën për t'u mbrojtur?»</w:t>
+      </w:r>
+    </w:p>
+    <w:p>
+      <w:r>
+        <w:t>Selimi buzëqeshi. Ishte hera e parë që Hyseni e shihte të buzëqeshte.</w:t>
+      </w:r>
+    </w:p>
+    <w:p>
+      <w:r>
+        <w:t>«Nuk do ta bëjë», tha. «E kam parë. Ai njeri i bën të gjitha me të djathtën.»</w:t>
+      </w:r>
+    </w:p>
+    <w:p>
+      <w:pPr>
+        <w:spacing w:before="200" w:after="200"/>
+        <w:ind w:firstLine="0"/>
+        <w:jc w:val="center"/>
+      </w:pPr>
+      <w:r>
+        <w:rPr>
+          <w:b w:val="0"/>
+          <w:i w:val="0"/>
+          <w:sz w:val="22"/>
+        </w:rPr>
+        <w:t>*   *   *</w:t>
+      </w:r>
+    </w:p>
+    <w:p>
+      <w:pPr>
+        <w:ind w:firstLine="0"/>
+      </w:pPr>
+      <w:r>
+        <w:t>Atë natë, në dhomën e tij në sarajin e pashait, Selim Efendiu nuk arrinte të flinte.</w:t>
+      </w:r>
+    </w:p>
+    <w:p>
+      <w:r>
+        <w:t>Nuk ishte pendimi. Selimi nuk kishte pendime prej shumë vitesh, dhe nuk e dinte më mirë si ishin. Ishte diçka tjetër. Një mendim i vogël, i bezdisshëm, si një plesht në kaftan.</w:t>
+      </w:r>
+    </w:p>
+    <w:p>
+      <w:r>
+        <w:t>U ngrit. Ndezi kandilin. Hapi fletoren.</w:t>
+      </w:r>
+    </w:p>
+    <w:p>
+      <w:r>
+        <w:t>Rilexoi gjithçka që kishte shkruar për Leshtejin. Të korrat. Taksat. Kufijtë. Familjet. Emrin, nën vidh. Viçin.</w:t>
+      </w:r>
+    </w:p>
+    <w:p>
+      <w:r>
+        <w:t>U ndal te një rresht që e kishte shkruar ditën e parë, dhe që pastaj e kishte harruar. Një gjë që i kishte thënë një plak, nën vidh, duke pirë kafe. Një farkëtar, i thatë dhe i kërrusur, me mjekrën të përcëlluar. Selimi e kishte pyetur për Halilin, dhe plaku kishte buzëqeshur në një mënyrë të çuditshme dhe kishte thënë një gjë që Selimi nuk e kishte kuptuar, dhe që e kishte shënuar vetëm nga përpikëria, siç shënonte gjithçka.</w:t>
+      </w:r>
+    </w:p>
+    <w:p>
+      <w:r>
+        <w:rPr>
+          <w:i/>
+        </w:rPr>
+        <w:t>Farkëtari thotë: është si gjyshi i tij.</w:t>
+      </w:r>
+    </w:p>
+    <w:p>
+      <w:r>
+        <w:t>Selimi e shikoi rreshtin gjatë, në dritën e kandilit.</w:t>
+      </w:r>
+    </w:p>
+    <w:p>
+      <w:r>
+        <w:t>Pastaj ngriti supet, mbylli fletoren dhe e fiku dritën.</w:t>
+      </w:r>
+    </w:p>
+    <w:p>
+      <w:r>
+        <w:t>Të gjithë burrat u ngjajnë gjyshërve të tyre. Nuk donte të thoshte asgjë.</w:t>
+      </w:r>
+    </w:p>
+    <w:p>
+      <w:pPr>
+        <w:sectPr>
+          <w:pgSz w:w="8391" w:h="11906"/>
+          <w:pgMar w:top="1134" w:right="1020" w:bottom="1134" w:left="1020" w:header="720" w:footer="720" w:gutter="0"/>
+          <w:cols w:space="720"/>
+          <w:docGrid w:linePitch="360"/>
+        </w:sectPr>
+      </w:pPr>
+    </w:p>
+    <w:p>
+      <w:pPr>
+        <w:spacing w:before="1200" w:after="80"/>
+        <w:ind w:firstLine="0"/>
+        <w:jc w:val="center"/>
+      </w:pPr>
+      <w:r>
+        <w:rPr>
+          <w:b w:val="0"/>
+          <w:i w:val="0"/>
+          <w:sz w:val="24"/>
+        </w:rPr>
+        <w:t>11</w:t>
+      </w:r>
+    </w:p>
+    <w:p>
+      <w:pPr>
+        <w:spacing w:before="0" w:after="600"/>
+        <w:ind w:firstLine="0"/>
+        <w:jc w:val="center"/>
+      </w:pPr>
+      <w:r>
+        <w:rPr>
+          <w:b/>
+          <w:i w:val="0"/>
+          <w:sz w:val="32"/>
+        </w:rPr>
+        <w:t>Shtiza</w:t>
+      </w:r>
+    </w:p>
+    <w:p>
+      <w:pPr>
+        <w:ind w:firstLine="0"/>
+      </w:pPr>
+      <w:r>
+        <w:t>Mulliri ishte në përrua, një orë rrugë nga fshati, aty ku uji zbriste aq shpejt sa të rrotullonte rrotën.</w:t>
+      </w:r>
+    </w:p>
+    <w:p>
+      <w:r>
+        <w:t>Halili shkonte atje çdo të enjte. E ngarkonte grurin mbi mushkë në mëngjes, e çonte poshtë, priste që mullixhiu ta bluante duke pirë kafe me të dhe duke folur për motin, dhe pasdite nisej me miellin. Bënte rrugën e gjatë, atë që kalonte nga ara e re në fushë, për t'i hedhur një sy grurit. Pastaj ngjitej përgjatë kanalit, mes kallamave, deri në fshat. Arrinte në shtëpi në perëndim.</w:t>
+      </w:r>
+    </w:p>
+    <w:p>
+      <w:r>
+        <w:t>E bënte prej katër vjetësh. E dinin të gjithë.</w:t>
+      </w:r>
+    </w:p>
+    <w:p>
+      <w:r>
+        <w:t>Atë të enjte tetori mullixhiu kishte punë, dhe mielli u bë gati vonë. Kur Halili u nis, dielli ishte ulur tashmë. Ngarkoi një thes mbi mushkë, njërin e vuri mbi supin e majtë sepse mushka ishte plakë dhe çalonte, dhe mori frerët me të djathtën.</w:t>
+      </w:r>
+    </w:p>
+    <w:p>
+      <w:r>
+        <w:t>U ndal te ara e re. Gruri i vjeshtës sapo kishte mbirë, i gjelbër dhe i dendur si qilim. E shikoi gjatë, me thesin në sup, i kënaqur. Mendoi Hatixhenë, barkun që rritej. Mendoi se po të ishte djalë do ta quante Murat, si gjyshin e nënës së tij. Po të ishte vajzë, do ta linte atë të zgjidhte.</w:t>
+      </w:r>
+    </w:p>
+    <w:p>
+      <w:r>
+        <w:t>Pastaj mori përsëri rrugën e kanalit.</w:t>
+      </w:r>
+    </w:p>
+    <w:p>
+      <w:pPr>
+        <w:spacing w:before="200" w:after="200"/>
+        <w:ind w:firstLine="0"/>
+        <w:jc w:val="center"/>
+      </w:pPr>
+      <w:r>
+        <w:rPr>
+          <w:b w:val="0"/>
+          <w:i w:val="0"/>
+          <w:sz w:val="22"/>
+        </w:rPr>
+        <w:t>*   *   *</w:t>
+      </w:r>
+    </w:p>
+    <w:p>
+      <w:pPr>
+        <w:ind w:firstLine="0"/>
+      </w:pPr>
+      <w:r>
+        <w:t>Kallamat ishin të lartë atë vit. Më të lartë se një burrë mbi kalë. Formonin dy mure të gjelbër e të verdhë anës shtegut, që shushurinin në erën e mbrëmjes sikur të flisnin me njëri-tjetrin. Dielli perëndonte drejt përpara tij, në fund të shtegut, dhe i hynte në sy. Halili ecte kokulur, me thesin në sup dhe mushkën pas.</w:t>
+      </w:r>
+    </w:p>
+    <w:p>
+      <w:r>
+        <w:t>Nuk dëgjoi asgjë.</w:t>
+      </w:r>
+    </w:p>
+    <w:p>
+      <w:r>
+        <w:t>E mendoi shumë herë, më pas. E mendoi për muaj, për vite. Pyeti veten si ishte e mundur, ai që në Izmail i dëgjonte rusët të vinin në mjegull, ai që në Rymnik ishte zgjuar para të gjithëve. Pyeti veten nëse kishte qenë shushurima e kallamave, apo dielli në sy, apo mendimi për Hatixhenë. Nuk gjeti kurrë një përgjigje.</w:t>
+      </w:r>
+    </w:p>
+    <w:p>
+      <w:r>
+        <w:t>Mushka, po. Mushka dëgjoi. U ndal befas dhe e tërhoqi kokën pas, dhe frerët u tendosën në dorën e Halilit, dhe krahu i djathtë i Halilit u zgjat prapa, i tendosur, larg trupit.</w:t>
+      </w:r>
+    </w:p>
+    <w:p>
+      <w:r>
+        <w:t>Në atë çast kallamat në të djathtën e tij u hapën.</w:t>
+      </w:r>
+    </w:p>
+    <w:p>
+      <w:r>
+        <w:t>Pa një burrë të vogël kundër diellit. Pa një shtizë. Pa majën: të gjerë, të shndritshme, të gjatë sa një parakrah, që zbriste nga lart me gjithë peshën e një trupi pas saj.</w:t>
+      </w:r>
+    </w:p>
+    <w:p>
+      <w:r>
+        <w:t>Nuk pati kohë të bënte asgjë.</w:t>
+      </w:r>
+    </w:p>
+    <w:p>
+      <w:r>
+        <w:t>Goditja i ra mbi kyçin e djathtë, me teh, si sëpata mbi trung.</w:t>
+      </w:r>
+    </w:p>
+    <w:p>
+      <w:pPr>
+        <w:spacing w:before="200" w:after="200"/>
+        <w:ind w:firstLine="0"/>
+        <w:jc w:val="center"/>
+      </w:pPr>
+      <w:r>
+        <w:rPr>
+          <w:b w:val="0"/>
+          <w:i w:val="0"/>
+          <w:sz w:val="22"/>
+        </w:rPr>
+        <w:t>*   *   *</w:t>
+      </w:r>
+    </w:p>
+    <w:p>
+      <w:pPr>
+        <w:ind w:firstLine="0"/>
+      </w:pPr>
+      <w:r>
+        <w:t>Nuk ndjeu dhimbje. Jo menjëherë.</w:t>
+      </w:r>
+    </w:p>
+    <w:p>
+      <w:r>
+        <w:t>Ndjeu një goditje, sikur dikush t'i kishte dhënë një shkop. Ndjeu frerët që i rrëshqisnin. Ndjeu mushkën që ikte duke pëllitur përgjatë shtegut. Ndjeu thesin e miellit që i binte nga supi dhe hapej përtokë, dhe miellin e bardhë që ngrihej si re.</w:t>
+      </w:r>
+    </w:p>
+    <w:p>
+      <w:r>
+        <w:t>Pastaj shikoi krahun.</w:t>
+      </w:r>
+    </w:p>
+    <w:p>
+      <w:r>
+        <w:t>Dora varej. E kapur për një rrip lëkure dhe pak tjetër. Gjaku dilte me vrull, i kuq, i ngrohtë, dhe binte mbi miellin e bardhë dhe e bënte rozë.</w:t>
+      </w:r>
+    </w:p>
+    <w:p>
+      <w:r>
+        <w:t>Burri me shtizë ishte zhdukur tashmë mes kallamave. Halili ia dëgjoi hapat që largoheshin me vrap, gjithnjë e më të dobët, drejt fushës. Nuk e ndoqi. E dinte që, po të bënte dhjetë hapa, do të vdiste.</w:t>
+      </w:r>
+    </w:p>
+    <w:p>
+      <w:r>
+        <w:t>U gjunjëzua.</w:t>
+      </w:r>
+    </w:p>
+    <w:p>
+      <w:r>
+        <w:t>Me të majtën zgjidhi brezin që mbante në mes, të gjatë, prej leshi. E mbështolli rreth parakrahut të djathtë, mbi kyç, mbi plagë. Kapi njërën anë me dhëmbë dhe tërhoqi. Tërhoqi me të majtën dhe me dhëmbë, fort, më fort, derisa brezi i hyri në mish. Gjaku u ngadalësua. Nuk u ndal. U ngadalësua.</w:t>
+      </w:r>
+    </w:p>
+    <w:p>
+      <w:r>
+        <w:t>Bëri një nyjë. Pastaj një tjetër.</w:t>
+      </w:r>
+    </w:p>
+    <w:p>
+      <w:r>
+        <w:t>Pastaj dhimbja erdhi e gjitha njëherësh, dhe për një çast bota u bë e bardhë si mielli.</w:t>
+      </w:r>
+    </w:p>
+    <w:p>
+      <w:pPr>
+        <w:spacing w:before="200" w:after="200"/>
+        <w:ind w:firstLine="0"/>
+        <w:jc w:val="center"/>
+      </w:pPr>
+      <w:r>
+        <w:rPr>
+          <w:b w:val="0"/>
+          <w:i w:val="0"/>
+          <w:sz w:val="22"/>
+        </w:rPr>
+        <w:t>*   *   *</w:t>
+      </w:r>
+    </w:p>
+    <w:p>
+      <w:pPr>
+        <w:ind w:firstLine="0"/>
+      </w:pPr>
+      <w:r>
+        <w:t>Kur hapi përsëri sytë dielli kishte perënduar.</w:t>
+      </w:r>
+    </w:p>
+    <w:p>
+      <w:r>
+        <w:t>Ishte ende i gjunjëzuar në shteg. Nuk e dinte sa kohë kishte kaluar. Krahu i djathtë i rrihte si një zemër e dytë. Vështroi përreth. Mushka nuk ishte. Fshati ishte gjysmë ore rrugë larg, përpjetë.</w:t>
+      </w:r>
+    </w:p>
+    <w:p>
+      <w:r>
+        <w:t>U ngrit.</w:t>
+      </w:r>
+    </w:p>
+    <w:p>
+      <w:r>
+        <w:t>Ra.</w:t>
+      </w:r>
+    </w:p>
+    <w:p>
+      <w:r>
+        <w:t>U ngrit përsëri, duke u mbështetur te kallamat me të majtën, dhe filloi të ecë.</w:t>
+      </w:r>
+    </w:p>
+    <w:p>
+      <w:r>
+        <w:t>Nuk e mbajti mend kurrë atë gjysmë ore. Mbajti mend vetëm errësirën që binte, kallamat që shushurinin, zërin e tij që numëronte hapat me zë të lartë, një, dy, tre, deri në njëqind, dhe pastaj fillonte përsëri nga një. Mbajti mend se kishte menduar Izmailin, Ramadanin me këmbën e plagosur, si e kishte tërhequr zvarrë nëpër rrugët që digjeshin. Mbajti mend se kishte menduar që tani askush nuk do ta tërhiqte zvarrë.</w:t>
+      </w:r>
+    </w:p>
+    <w:p>
+      <w:r>
+        <w:t>Mushka kishte arritur vetë në fshat, me thesin e miellit ende mbi shpinë dhe frerët të përlyer me gjak. Bajrami e pa të hynte në lëmë dhe e kuptoi. Vrapoi poshtë nëpër shtegun e kanalit duke thirrur emrin e të vëllait, dhe pas tij vraponin Ramadani me këmbën e tij të çalë dhe gjysma e fshatit me fenerë.</w:t>
+      </w:r>
+    </w:p>
+    <w:p>
+      <w:r>
+        <w:t>E gjetën poshtë kthesës së fundit, njëqind hapa nga shtëpitë e para. Ende ecte. E kishte krahun e djathtë të shtrënguar pas gjoksit, dorën që varej, fytyrën të bardhë si mielli që kishte mbi rroba.</w:t>
+      </w:r>
+    </w:p>
+    <w:p>
+      <w:r>
+        <w:t>Kur pa fenerët u ndal.</w:t>
+      </w:r>
+    </w:p>
+    <w:p>
+      <w:r>
+        <w:t>«Zylo», tha. Pastaj ra përpara, dhe Bajrami e zuri para se të prekte tokën.</w:t>
+      </w:r>
+    </w:p>
+    <w:p>
+      <w:pPr>
+        <w:spacing w:before="200" w:after="200"/>
+        <w:ind w:firstLine="0"/>
+        <w:jc w:val="center"/>
+      </w:pPr>
+      <w:r>
+        <w:rPr>
+          <w:b w:val="0"/>
+          <w:i w:val="0"/>
+          <w:sz w:val="22"/>
+        </w:rPr>
+        <w:t>*   *   *</w:t>
+      </w:r>
+    </w:p>
+    <w:p>
+      <w:pPr>
+        <w:ind w:firstLine="0"/>
+      </w:pPr>
+      <w:r>
+        <w:t>E çuan në dyqanin e farkëtarit, sepse në fshat nuk kishte mjek dhe Zylo kishte vënë në vend më shumë kocka se çdo mjek.</w:t>
+      </w:r>
+    </w:p>
+    <w:p>
+      <w:r>
+        <w:t>Zylo ishte shumë plak tashmë. Nuk e rrihte më hekurin prej vitesh. Por kur e pa Halilin të shtrirë mbi tezgën e tij, në dritën e fenerëve, me krahun në atë gjendje, diçka iu ndryshua në sy. U drejtua. Për një çast u duk përsëri burri që kishte qenë.</w:t>
+      </w:r>
+    </w:p>
+    <w:p>
+      <w:r>
+        <w:t>«Jashtë», tha. «Të gjithë jashtë. Bajram, ti rri. Ramadan, kaceku.»</w:t>
+      </w:r>
+    </w:p>
+    <w:p>
+      <w:r>
+        <w:t>E shikoi plagën gjatë, pa e prekur.</w:t>
+      </w:r>
+    </w:p>
+    <w:p>
+      <w:r>
+        <w:t>«Dora nuk shpëton», tha.</w:t>
+      </w:r>
+    </w:p>
+    <w:p>
+      <w:r>
+        <w:t>Askush nuk u përgjigj. Bajrami qante pa zë, me fytyrën pas murit. Ramadani i frynte kacekut, dhe qymyri në farkë bëhej i kuq, portokalli, i bardhë.</w:t>
+      </w:r>
+    </w:p>
+    <w:p>
+      <w:r>
+        <w:t>Zylo mori një thikë nga tezga. E mprehu mbi gur, ngadalë, me kujdes. Pastaj shikoi Halilin. Halili i kishte sytë hapur. E shikonte.</w:t>
+      </w:r>
+    </w:p>
+    <w:p>
+      <w:r>
+        <w:t>«Do të të dhembë», tha plaku.</w:t>
+      </w:r>
+    </w:p>
+    <w:p>
+      <w:r>
+        <w:t>«E di.»</w:t>
+      </w:r>
+    </w:p>
+    <w:p>
+      <w:r>
+        <w:t>Zylo i vuri në gojë një copë lëkure. Pastaj, para se të fillonte, u përkul mbi të dhe i tha diçka në vesh, aq ngadalë sa as Bajrami as Ramadani nuk arritën ta dëgjonin.</w:t>
+      </w:r>
+    </w:p>
+    <w:p>
+      <w:r>
+        <w:t>Halili i mbylli sytë.</w:t>
+      </w:r>
+    </w:p>
+    <w:p>
+      <w:r>
+        <w:t>Atë që erdhi më pas, Ramadani nuk ia tregoi kurrë askujt. Tha vetëm se zgjati pak, se Zylo kishte duar më të qëndrueshme nga ç'dukej e mundur, dhe se kur hekuri i skuqur preku mishin era mbushi dyqanin dhe Halili e kafshoi lëkurën derisa e çau, por nuk bërtiti. As edhe një herë.</w:t>
+      </w:r>
+    </w:p>
+    <w:p>
+      <w:pPr>
+        <w:spacing w:before="200" w:after="200"/>
+        <w:ind w:firstLine="0"/>
+        <w:jc w:val="center"/>
+      </w:pPr>
+      <w:r>
+        <w:rPr>
+          <w:b w:val="0"/>
+          <w:i w:val="0"/>
+          <w:sz w:val="22"/>
+        </w:rPr>
+        <w:t>*   *   *</w:t>
+      </w:r>
+    </w:p>
+    <w:p>
+      <w:pPr>
+        <w:ind w:firstLine="0"/>
+      </w:pPr>
+      <w:r>
+        <w:t>Të nesërmen lajmi kishte arritur në të gjitha fshatrat e fushës.</w:t>
+      </w:r>
+    </w:p>
+    <w:p>
+      <w:r>
+        <w:t>Halili i Leshtejit. Ai i Rymnikut dhe i Izmailit. Ai që kishte tharë kënetën dhe kishte ngritur viçin me gishtin e vogël. Dikush e kishte pritur në kallamishte dhe i kishte prerë dorën e djathtë.</w:t>
+      </w:r>
+    </w:p>
+    <w:p>
+      <w:r>
+        <w:t>Askush nuk e dinte kush. U fol për kusarë, për një hakmarrje për kushedi çfarë historie të luftës, për një të çmendur. U fol për mullixhiun, që e kishte nisur vonë. U fol madje edhe për Shabanin dhe gurin e kufirit, derisa Shabani, kur e dëgjoi, shkoi nën vidh dhe filloi të bërtasë me lot në sy se do ta vriste me duart e tij këdo që e përsëriste, dhe që atë ditë askush nuk e përsëriti.</w:t>
+      </w:r>
+    </w:p>
+    <w:p>
+      <w:r>
+        <w:t>Në fund njerëzit pushuan së pyeturi kush. Pyesnin tjetër gjë.</w:t>
+      </w:r>
+    </w:p>
+    <w:p>
+      <w:r>
+        <w:t>Gratë te kroi, burrat nën vidh, pleqtë para xhamisë. Të gjithë thoshin të njëjtën gjë, me zë të ulët, duke tundur kokën, siç thuhet për një të vdekur.</w:t>
+      </w:r>
+    </w:p>
+    <w:p>
+      <w:r>
+        <w:rPr>
+          <w:i/>
+        </w:rPr>
+        <w:t>I shkreti Halil. Mbaroi.</w:t>
+      </w:r>
+    </w:p>
+    <w:p>
+      <w:pPr>
+        <w:spacing w:before="200" w:after="200"/>
+        <w:ind w:firstLine="0"/>
+        <w:jc w:val="center"/>
+      </w:pPr>
+      <w:r>
+        <w:rPr>
+          <w:b w:val="0"/>
+          <w:i w:val="0"/>
+          <w:sz w:val="22"/>
+        </w:rPr>
+        <w:t>*   *   *</w:t>
+      </w:r>
+    </w:p>
+    <w:p>
+      <w:pPr>
+        <w:ind w:firstLine="0"/>
+      </w:pPr>
+      <w:r>
+        <w:t>Tri ditë me kalë larg, përtej Shkumbinit, në sarajin e pashait, Selim Efendiu mori një letër pa firmë.</w:t>
+      </w:r>
+    </w:p>
+    <w:p>
+      <w:r>
+        <w:t>Përmbante vetëm një fjalë.</w:t>
+      </w:r>
+    </w:p>
+    <w:p>
+      <w:r>
+        <w:t>E lexoi, e dogji në flakën e kandilit, dhe pastaj hapi fletoren e tij. Poshtë rreshtit të fundit për Leshtejin, me shkrimin e tij të imët dhe të rregullt, shkroi datën. Dhe pranë datës, një fjalë të vetme, të njëjtën si në letër.</w:t>
+      </w:r>
+    </w:p>
+    <w:p>
+      <w:r>
+        <w:rPr>
+          <w:i/>
+        </w:rPr>
+        <w:t>U bë.</w:t>
+      </w:r>
+    </w:p>
+    <w:p>
+      <w:pPr>
+        <w:sectPr>
+          <w:pgSz w:w="8391" w:h="11906"/>
+          <w:pgMar w:top="1134" w:right="1020" w:bottom="1134" w:left="1020" w:header="720" w:footer="720" w:gutter="0"/>
+          <w:cols w:space="720"/>
+          <w:docGrid w:linePitch="360"/>
+        </w:sectPr>
+      </w:pPr>
+    </w:p>
+    <w:p>
+      <w:pPr>
+        <w:spacing w:before="1200" w:after="80"/>
+        <w:ind w:firstLine="0"/>
+        <w:jc w:val="center"/>
+      </w:pPr>
+      <w:r>
+        <w:rPr>
+          <w:b w:val="0"/>
+          <w:i w:val="0"/>
+          <w:sz w:val="24"/>
+        </w:rPr>
+        <w:t>12</w:t>
+      </w:r>
+    </w:p>
+    <w:p>
+      <w:pPr>
+        <w:spacing w:before="0" w:after="600"/>
+        <w:ind w:firstLine="0"/>
+        <w:jc w:val="center"/>
+      </w:pPr>
+      <w:r>
+        <w:rPr>
+          <w:b/>
+          <w:i w:val="0"/>
+          <w:sz w:val="32"/>
+        </w:rPr>
+        <w:t>Netët</w:t>
+      </w:r>
+    </w:p>
+    <w:p>
+      <w:pPr>
+        <w:ind w:firstLine="0"/>
+      </w:pPr>
+      <w:r>
+        <w:t>Ethet zgjatën nëntë ditë.</w:t>
+      </w:r>
+    </w:p>
+    <w:p>
+      <w:r>
+        <w:t>Nëntë ditë në të cilat Halili nuk e dinte ku ishte. Ndonjëherë ishte në Izmail, në bodrum, me zjarrin mbi kokë. Ndonjëherë ishte në Nikolaev, në baltën e lumit, me një trung mbi shpatulla. Ndonjëherë ishte në lëmin e të atit, fëmijë, dhe e ëma ia hiqte lugën nga dora dhe ia vinte në tjetrën, dhe ai donte ta pyeste pse dhe nuk mundte.</w:t>
+      </w:r>
+    </w:p>
+    <w:p>
+      <w:r>
+        <w:t>Hatixheja nuk lëvizi kurrë prej andej.</w:t>
+      </w:r>
+    </w:p>
+    <w:p>
+      <w:r>
+        <w:t>Ia ndërronte fashat mbi cungun dy herë në ditë, me barërat që i kishte dhënë Zylo dhe ujin e zier. I lagte ballin me pece të ftohta. I mbante kokën kur villte. Natën flinte ulur pranë shtratit, me kokën mbështetur te dysheku, dhe zgjohej me çdo frymëmarrje të tij. Barkun e kishte tashmë të rrumbullakët, dhe e ëma e Halilit i thoshte të pushonte, ta linte atë. Hatixheja as nuk përgjigjej.</w:t>
+      </w:r>
+    </w:p>
+    <w:p>
+      <w:r>
+        <w:t>Ditën e dhjetë Halili hapi sytë dhe e pa.</w:t>
+      </w:r>
+    </w:p>
+    <w:p>
+      <w:r>
+        <w:t>«Kam etje», tha.</w:t>
+      </w:r>
+    </w:p>
+    <w:p>
+      <w:r>
+        <w:t>Hatixheja filloi të qajë, dhe i solli ujë.</w:t>
+      </w:r>
+    </w:p>
+    <w:p>
+      <w:pPr>
+        <w:spacing w:before="200" w:after="200"/>
+        <w:ind w:firstLine="0"/>
+        <w:jc w:val="center"/>
+      </w:pPr>
+      <w:r>
+        <w:rPr>
+          <w:b w:val="0"/>
+          <w:i w:val="0"/>
+          <w:sz w:val="22"/>
+        </w:rPr>
+        <w:t>*   *   *</w:t>
+      </w:r>
+    </w:p>
+    <w:p>
+      <w:pPr>
+        <w:ind w:firstLine="0"/>
+      </w:pPr>
+      <w:r>
+        <w:t>Pastaj erdhën vizitat.</w:t>
+      </w:r>
+    </w:p>
+    <w:p>
+      <w:r>
+        <w:t>Erdhi gjithë fshati, pak nga pak, siç shkohet te një i sëmurë që nuk do të shërohet. Gratë sillnin pite, djathëra, vezë, mjaltë. Burrat uleshin në buzë të shtratit, flisnin për të korrat dhe për motin pa e parë krahun e fashuar, dhe iknin shpejt. Fëmijët përgjonin nga dera, të trembur dhe kureshtarë.</w:t>
+      </w:r>
+    </w:p>
+    <w:p>
+      <w:r>
+        <w:t>Të gjithë kishin të njëjtën fytyrë. Halili e njihte. E kishte parë në luftë, në fytyrat e shokëve që shikonin një të plagosur rëndë. Ishte fytyra që bën përballë dikujt që ka vdekur tashmë pak.</w:t>
+      </w:r>
+    </w:p>
+    <w:p>
+      <w:r>
+        <w:t>Erdhi edhe Zeneli, vjehrri i tij, i mbështetur te shkopi. U ul pranë shtratit dhe heshti gjatë.</w:t>
+      </w:r>
+    </w:p>
+    <w:p>
+      <w:r>
+        <w:t>«Tokën do ta punojë Bajrami», tha në fund. «Dhe Ramadani. Dhe unë do të dërgoj nipërit e mi. Mos u shqetëso për tokën.»</w:t>
+      </w:r>
+    </w:p>
+    <w:p>
+      <w:r>
+        <w:t>«Nuk shqetësohem.»</w:t>
+      </w:r>
+    </w:p>
+    <w:p>
+      <w:r>
+        <w:t>Zeneli e shikoi.</w:t>
+      </w:r>
+    </w:p>
+    <w:p>
+      <w:r>
+        <w:t>«Je ende burrë», tha, ngadalë, sikur donte të bindte edhe veten. «Ke grua. Do të kesh djalë. Je ende burrë, Halil.»</w:t>
+      </w:r>
+    </w:p>
+    <w:p>
+      <w:r>
+        <w:t>«E di.»</w:t>
+      </w:r>
+    </w:p>
+    <w:p>
+      <w:r>
+        <w:t>Plaku pohoi me kokë, i preku gjurin, iku. Te dera fshiu sytë me mëngë, duke menduar se Halili nuk e shihte.</w:t>
+      </w:r>
+    </w:p>
+    <w:p>
+      <w:pPr>
+        <w:spacing w:before="200" w:after="200"/>
+        <w:ind w:firstLine="0"/>
+        <w:jc w:val="center"/>
+      </w:pPr>
+      <w:r>
+        <w:rPr>
+          <w:b w:val="0"/>
+          <w:i w:val="0"/>
+          <w:sz w:val="22"/>
+        </w:rPr>
+        <w:t>*   *   *</w:t>
+      </w:r>
+    </w:p>
+    <w:p>
+      <w:pPr>
+        <w:ind w:firstLine="0"/>
+      </w:pPr>
+      <w:r>
+        <w:t>Erdhi Rexhepi.</w:t>
+      </w:r>
+    </w:p>
+    <w:p>
+      <w:r>
+        <w:t>Erdhi një mbrëmje vonë, kur të gjithë kishin ikur, dhe Hatixheja, kur e pa, doli nga dhoma pa ia kërkuar njeri. Plaku u ul në karrigen pranë shtratit, me një ngërdheshje për kurrizin.</w:t>
+      </w:r>
+    </w:p>
+    <w:p>
+      <w:r>
+        <w:t>Shikoi cungun e fashuar. Shikoi të birin.</w:t>
+      </w:r>
+    </w:p>
+    <w:p>
+      <w:r>
+        <w:t>«Thika e gjyshit tënd», tha. «E ke ende?»</w:t>
+      </w:r>
+    </w:p>
+    <w:p>
+      <w:r>
+        <w:t>Halili bëri një shenjë drejt arkës te këmbët e shtratit. Rexhepi u ngrit, e hapi, kërkoi mes rrobave. Gjeti bohçen prej pëlhure. E hapi. Thika ishte aty, me dorezën prej briri dhe vijat e saj. Pesë më shumë se kur ia kishte dhënë të birit.</w:t>
+      </w:r>
+    </w:p>
+    <w:p>
+      <w:r>
+        <w:t>Rexhepi i numëroi me gisht. Nuk pyeti asgjë.</w:t>
+      </w:r>
+    </w:p>
+    <w:p>
+      <w:r>
+        <w:t>E futi përsëri thikën në pëlhurë dhe e vuri mbi shtrat, pranë dorës që i kishte mbetur Halilit.</w:t>
+      </w:r>
+    </w:p>
+    <w:p>
+      <w:r>
+        <w:t>«Gjyshi yt», tha, «një herë, i ri, theu një krah. Duke rënë nga një pemë. E mbajti të fashuar tre muaj.» U ul përsëri. «Fshati thoshte që nuk do të mund të punonte më. Ai qeshte.»</w:t>
+      </w:r>
+    </w:p>
+    <w:p>
+      <w:r>
+        <w:t>«Pse qeshte?»</w:t>
+      </w:r>
+    </w:p>
+    <w:p>
+      <w:r>
+        <w:t>Rexhepi e shikoi të birin gjatë, me sytë që koha i kishte bërë të çelët.</w:t>
+      </w:r>
+    </w:p>
+    <w:p>
+      <w:r>
+        <w:t>«Sepse kishte thyer atë që duhej», tha.</w:t>
+      </w:r>
+    </w:p>
+    <w:p>
+      <w:r>
+        <w:t>Pastaj u ngrit, i preku kokën si kur ishte fëmijë, dhe iku.</w:t>
+      </w:r>
+    </w:p>
+    <w:p>
+      <w:pPr>
+        <w:spacing w:before="200" w:after="200"/>
+        <w:ind w:firstLine="0"/>
+        <w:jc w:val="center"/>
+      </w:pPr>
+      <w:r>
+        <w:rPr>
+          <w:b w:val="0"/>
+          <w:i w:val="0"/>
+          <w:sz w:val="22"/>
+        </w:rPr>
+        <w:t>*   *   *</w:t>
+      </w:r>
+    </w:p>
+    <w:p>
+      <w:pPr>
+        <w:ind w:firstLine="0"/>
+      </w:pPr>
+      <w:r>
+        <w:t>Në dhjetor Halili u ngrit nga shtrati.</w:t>
+      </w:r>
+    </w:p>
+    <w:p>
+      <w:r>
+        <w:t>Ishte dobësuar. Cungu ishte ende i kuq dhe i ënjtur, por mishi po mbyllej, dhe Zylo, kur erdhi ta shikonte, gërhiti dhe tha se nuk kishte parë kurrë njeri të shërohej kaq shpejt. Halili doli në lëmë. U ul nën manin lakuriq, në diellin e ftohtë të dimrit, dhe shikoi tokën e tij.</w:t>
+      </w:r>
+    </w:p>
+    <w:p>
+      <w:r>
+        <w:t>Në ditët që pasuan filloi të bëjë gjërat. Gjëra të vogla, në fillim. Të mbante dru. T'u jepte të hanin bagëtive. Të rregullonte një gardh. Fshati e shikonte, dhe tundte kokën. I shkreti Halil. Shiko si ia del. Shiko si është bërë.</w:t>
+      </w:r>
+    </w:p>
+    <w:p>
+      <w:r>
+        <w:t>Një mëngjes thirri Bajramin në stallë.</w:t>
+      </w:r>
+    </w:p>
+    <w:p>
+      <w:r>
+        <w:t>«Më duhet një copë dru», tha. «Thane. E fortë. E gjatë kështu.» Hapi krahun e majtë. «E skuadruar, me dorezë. Dhe e rëndë. Futi pak plumb këtu, në majë.»</w:t>
+      </w:r>
+    </w:p>
+    <w:p>
+      <w:r>
+        <w:t>Bajrami e shikoi pa kuptuar.</w:t>
+      </w:r>
+    </w:p>
+    <w:p>
+      <w:r>
+        <w:t>«Një shpatë druri?»</w:t>
+      </w:r>
+    </w:p>
+    <w:p>
+      <w:r>
+        <w:t>«Një shpatë druri.»</w:t>
+      </w:r>
+    </w:p>
+    <w:p>
+      <w:r>
+        <w:t>«Dhe çfarë do të bësh me një shpatë druri?»</w:t>
+      </w:r>
+    </w:p>
+    <w:p>
+      <w:r>
+        <w:t>Halili e shikoi të vëllanë. Për herë të parë që nga tetori, diçka iu lëviz në cepat e buzëve.</w:t>
+      </w:r>
+    </w:p>
+    <w:p>
+      <w:r>
+        <w:t>«Është për djalin tim», tha.</w:t>
+      </w:r>
+    </w:p>
+    <w:p>
+      <w:r>
+        <w:t>Bajrami qeshi. Pastaj pushoi së qeshuri dhe e shikoi më mirë. Pastaj shkoi të kërkonte thanën.</w:t>
+      </w:r>
+    </w:p>
+    <w:p>
+      <w:pPr>
+        <w:spacing w:before="200" w:after="200"/>
+        <w:ind w:firstLine="0"/>
+        <w:jc w:val="center"/>
+      </w:pPr>
+      <w:r>
+        <w:rPr>
+          <w:b w:val="0"/>
+          <w:i w:val="0"/>
+          <w:sz w:val="22"/>
+        </w:rPr>
+        <w:t>*   *   *</w:t>
+      </w:r>
+    </w:p>
+    <w:p>
+      <w:pPr>
+        <w:ind w:firstLine="0"/>
+      </w:pPr>
+      <w:r>
+        <w:t>Netët filluan në janar.</w:t>
+      </w:r>
+    </w:p>
+    <w:p>
+      <w:r>
+        <w:t>Herën e parë që Hatixheja u zgjua dhe nuk e gjeti në shtrat, u tremb. Mendoi ethet, jermin. U ngrit, hodhi shallin, doli në të ftohtë. Hëna ishte plot dhe bora, e hollë, mbulonte lëmin. Mbi borë kishte gjurmë që shkonin drejt stallës.</w:t>
+      </w:r>
+    </w:p>
+    <w:p>
+      <w:r>
+        <w:t>Iu afrua derës. Ishte e hapur pak. Brenda ishte një fener i ndezur, i ulët, pas grazhdit.</w:t>
+      </w:r>
+    </w:p>
+    <w:p>
+      <w:r>
+        <w:t>Dhe kishte një zhurmë.</w:t>
+      </w:r>
+    </w:p>
+    <w:p>
+      <w:r>
+        <w:t>Hatixheja u ndal me dorën mbi derë. Dëgjoi.</w:t>
+      </w:r>
+    </w:p>
+    <w:p>
+      <w:r>
+        <w:t>Ishte një zhurmë druri kundër druri. Goditje të thata, kundër diçkaje të fortë: një trau, ndoshta, ose shtylla në mes të stallës. Dhe mes një goditjeje dhe tjetrës, një frymëmarrje. E rëndë. E rregullt.</w:t>
+      </w:r>
+    </w:p>
+    <w:p>
+      <w:r>
+        <w:t>Goditjet kishin një ritëm. Një goditje e fortë, një e lehtë, një e fortë.</w:t>
+      </w:r>
+    </w:p>
+    <w:p>
+      <w:r>
+        <w:t>Si një zemër.</w:t>
+      </w:r>
+    </w:p>
+    <w:p>
+      <w:r>
+        <w:t>Hatixheja e njihte atë ritëm. E kishte dëgjuar shumë herë, si vajzë, duke kaluar para dyqanit të Zylos, kur Halili e ndihmonte plakun të rrihte hekurin.</w:t>
+      </w:r>
+    </w:p>
+    <w:p>
+      <w:r>
+        <w:t>Mbeti aty, me dorën mbi derë, gjatë. I ftohti i hynte në këmbët e zbathura. Brenda stallës goditjet vazhdonin, një e fortë, një e lehtë, një e fortë, dhe herë pas here ndaleshin, dhe dëgjohej frymëmarrja, dhe pastaj niseshin përsëri. Më të shpejta. Më të sigurta.</w:t>
+      </w:r>
+    </w:p>
+    <w:p>
+      <w:r>
+        <w:t>Nuk hyri.</w:t>
+      </w:r>
+    </w:p>
+    <w:p>
+      <w:r>
+        <w:t>U kthye në shtrat, u fut nën mbulesa, shtrëngoi barkun me duar. Foshnja lëvizte. Shqelmonte, sikur të kishte dëgjuar edhe ajo.</w:t>
+      </w:r>
+    </w:p>
+    <w:p>
+      <w:r>
+        <w:t>Hatixheja buzëqeshi në errësirë.</w:t>
+      </w:r>
+    </w:p>
+    <w:p>
+      <w:r>
+        <w:t>Kur Halili u kthye, pak para agimit, ajo bëri sikur flinte. Ai u shtri pranë saj ngadalë, për të mos e zgjuar. Kishte lëkurën të ftohtë dhe të djersitur njëkohësisht, dhe merrte ende frymë fort.</w:t>
+      </w:r>
+    </w:p>
+    <w:p>
+      <w:r>
+        <w:t>«Ku ishe?» pyeti ajo, pa i hapur sytë.</w:t>
+      </w:r>
+    </w:p>
+    <w:p>
+      <w:r>
+        <w:t>Një heshtje.</w:t>
+      </w:r>
+    </w:p>
+    <w:p>
+      <w:r>
+        <w:t>«Në stallë. Lopa.»</w:t>
+      </w:r>
+    </w:p>
+    <w:p>
+      <w:r>
+        <w:t>«Ah», tha Hatixheja. «Lopa.»</w:t>
+      </w:r>
+    </w:p>
+    <w:p>
+      <w:r>
+        <w:t>Nuk pyeti tjetër.</w:t>
+      </w:r>
+    </w:p>
+    <w:p>
+      <w:pPr>
+        <w:spacing w:before="200" w:after="200"/>
+        <w:ind w:firstLine="0"/>
+        <w:jc w:val="center"/>
+      </w:pPr>
+      <w:r>
+        <w:rPr>
+          <w:b w:val="0"/>
+          <w:i w:val="0"/>
+          <w:sz w:val="22"/>
+        </w:rPr>
+        <w:t>*   *   *</w:t>
+      </w:r>
+    </w:p>
+    <w:p>
+      <w:pPr>
+        <w:ind w:firstLine="0"/>
+      </w:pPr>
+      <w:r>
+        <w:t>Erdhi edhe Ramadani, një mbrëmje shkurti, me këmbën e tij të çalë dhe një faqore me raki.</w:t>
+      </w:r>
+    </w:p>
+    <w:p>
+      <w:r>
+        <w:t>U ulën nën pjergullën lakuriqe, me pelerina, dhe pinë në heshtje, duke parë dritat e Kavajës në fushë. I ftohti ishte i thatë, dhe yjet ishin shumë.</w:t>
+      </w:r>
+    </w:p>
+    <w:p>
+      <w:r>
+        <w:t>«Thonë që mbarove», tha Ramadani në fund.</w:t>
+      </w:r>
+    </w:p>
+    <w:p>
+      <w:r>
+        <w:t>«E di.»</w:t>
+      </w:r>
+    </w:p>
+    <w:p>
+      <w:r>
+        <w:t>«E thonë të gjithë. Nën vidh, te kroi, në pazarin e Kavajës. I shkreti Halil.» Ramadani piu. «Babai im qau tri ditë.»</w:t>
+      </w:r>
+    </w:p>
+    <w:p>
+      <w:r>
+        <w:t>«Babai yt qan lehtë.»</w:t>
+      </w:r>
+    </w:p>
+    <w:p>
+      <w:r>
+        <w:t>«Babai im nuk qan kurrë. Qesh.» Ramadani e rrotulloi faqoren në duar. «Kalova para stallës, mbrëmë. Vonë.»</w:t>
+      </w:r>
+    </w:p>
+    <w:p>
+      <w:r>
+        <w:t>Halili nuk u përgjigj.</w:t>
+      </w:r>
+    </w:p>
+    <w:p>
+      <w:r>
+        <w:t>«Dëgjova ca zhurma.»</w:t>
+      </w:r>
+    </w:p>
+    <w:p>
+      <w:r>
+        <w:t>Heshtje. Larg, në fshat, lehu një qen.</w:t>
+      </w:r>
+    </w:p>
+    <w:p>
+      <w:r>
+        <w:t>Ramadani piu përsëri. Pastaj e vuri faqoren mbi mur, mes tyre të dyve.</w:t>
+      </w:r>
+    </w:p>
+    <w:p>
+      <w:r>
+        <w:t>«Në Izmail», tha, «kishte shumë tym.»</w:t>
+      </w:r>
+    </w:p>
+    <w:p>
+      <w:r>
+        <w:t>Halili u kthye ta shikonte. Ramadani shikonte dritat e Kavajës. Kishte një buzëqeshje të vogël, të shtrembër, që ia tërhiqte njërin cep të gojës.</w:t>
+      </w:r>
+    </w:p>
+    <w:p>
+      <w:r>
+        <w:t>«Kishte shumë tym», përsëriti Halili.</w:t>
+      </w:r>
+    </w:p>
+    <w:p>
+      <w:r>
+        <w:t>«Shumë.»</w:t>
+      </w:r>
+    </w:p>
+    <w:p>
+      <w:r>
+        <w:t>Ndenjën ulur gjatë, nën yje, pa thënë më asgjë. Pastaj Ramadani u ngrit, mori faqoren, dhe para se të ikte i vuri një dorë mbi sup. Mbi të majtin.</w:t>
+      </w:r>
+    </w:p>
+    <w:p>
+      <w:r>
+        <w:t>«Jam i gëzuar», tha vetëm. Dhe iku duke çaluar në errësirë.</w:t>
+      </w:r>
+    </w:p>
+    <w:p>
+      <w:pPr>
+        <w:sectPr>
+          <w:pgSz w:w="8391" w:h="11906"/>
+          <w:pgMar w:top="1134" w:right="1020" w:bottom="1134" w:left="1020" w:header="720" w:footer="720" w:gutter="0"/>
+          <w:cols w:space="720"/>
+          <w:docGrid w:linePitch="360"/>
+        </w:sectPr>
+      </w:pPr>
+    </w:p>
+    <w:p>
+      <w:pPr>
+        <w:spacing w:before="1200" w:after="80"/>
+        <w:ind w:firstLine="0"/>
+        <w:jc w:val="center"/>
+      </w:pPr>
+      <w:r>
+        <w:rPr>
+          <w:b w:val="0"/>
+          <w:i w:val="0"/>
+          <w:sz w:val="24"/>
+        </w:rPr>
+        <w:t>13</w:t>
+      </w:r>
+    </w:p>
+    <w:p>
+      <w:pPr>
+        <w:spacing w:before="0" w:after="600"/>
+        <w:ind w:firstLine="0"/>
+        <w:jc w:val="center"/>
+      </w:pPr>
+      <w:r>
+        <w:rPr>
+          <w:b/>
+          <w:i w:val="0"/>
+          <w:sz w:val="32"/>
+        </w:rPr>
+        <w:t>Sfida</w:t>
+      </w:r>
+    </w:p>
+    <w:p>
+      <w:pPr>
+        <w:ind w:firstLine="0"/>
+      </w:pPr>
+      <w:r>
+        <w:t>Erdhën javën e fundit të shkurtit, me baltën deri te nyjet e kuajve.</w:t>
+      </w:r>
+    </w:p>
+    <w:p>
+      <w:r>
+        <w:t>Ishin nja njëzet burra të armatosur, mbi kuaj, me pushkët krahaqafë dhe çallmat e kuqe. Në mes tyre ishin dy burra që nuk ngjanin me të tjerët. Njëri ishte një vigan, me mjekrën e zezë deri në gjoks, mbi një kalë që dukej i vogël poshtë tij. Tjetri ishte i hollë, me mjekrën të prerë me majë, një kaftan të errët dhe një kuti prej kadifeje jeshile të varur në shalë.</w:t>
+      </w:r>
+    </w:p>
+    <w:p>
+      <w:r>
+        <w:t>U ndalën në shesh, nën vidh.</w:t>
+      </w:r>
+    </w:p>
+    <w:p>
+      <w:r>
+        <w:t>Fshati u mblodh me nxitim, siç mblidhet para një zjarri. Burrat nga arat me shatët ende në dorë, gratë nëpër dyer, fëmijët mes këmbëve të të rriturve. Pleqtë e këshillit erdhën të fundit, ngadalë, dhe u ulën mbi gurët e tyre. Zeneli rrinte në mes, me shkopin mes gjunjëve.</w:t>
+      </w:r>
+    </w:p>
+    <w:p>
+      <w:r>
+        <w:t>Burri i hollë zbriti nga kali. Rregulloi kaftanin. Vështroi përreth me qetësi, sikur të kishte ardhur në një festë.</w:t>
+      </w:r>
+    </w:p>
+    <w:p>
+      <w:r>
+        <w:t>E njohu e para gruaja e mullixhiut.</w:t>
+      </w:r>
+    </w:p>
+    <w:p>
+      <w:r>
+        <w:t>«Tregtari», tha. «Është tregtari i vajit. Ai i verës.»</w:t>
+      </w:r>
+    </w:p>
+    <w:p>
+      <w:r>
+        <w:t>Një pëshpëritje kaloi mes turmës. E njohën edhe të tjerët. Njeriu i sjellshëm që blinte vajin dhe leshin, që pinte kafe nën vidh dhe bënte pyetje për të korrat. Që paguante mirë dhe nuk nxitonte kurrë.</w:t>
+      </w:r>
+    </w:p>
+    <w:p>
+      <w:r>
+        <w:t>Selim Efendiu buzëqeshi.</w:t>
+      </w:r>
+    </w:p>
+    <w:p>
+      <w:r>
+        <w:t>«Unë blej dhe shes», tha, me zërin e tij të ulët. Të gjithëve iu desh të heshtnin për ta dëgjuar. «Këtë verë blija vaj. Sot shes drejtësi.»</w:t>
+      </w:r>
+    </w:p>
+    <w:p>
+      <w:pPr>
+        <w:spacing w:before="200" w:after="200"/>
+        <w:ind w:firstLine="0"/>
+        <w:jc w:val="center"/>
+      </w:pPr>
+      <w:r>
+        <w:rPr>
+          <w:b w:val="0"/>
+          <w:i w:val="0"/>
+          <w:sz w:val="22"/>
+        </w:rPr>
+        <w:t>*   *   *</w:t>
+      </w:r>
+    </w:p>
+    <w:p>
+      <w:pPr>
+        <w:ind w:firstLine="0"/>
+      </w:pPr>
+      <w:r>
+        <w:t>Nxori një fletë, të mbështjellë, me një vulë dylli të kuq. E shpalosi. E lexoi me zë të lartë, fillimisht turqisht, pastaj shqip.</w:t>
+      </w:r>
+    </w:p>
+    <w:p>
+      <w:r>
+        <w:t>Thoshte, me shumë fjalë, një gjë të thjeshtë. Thoshte se tokat e fushës poshtë Leshtejit nuk kishin tapi. Se askush nuk kishte paguar kurrë për t'i pasur. Se këneta e tharë ishte tokë e Sulltanit, dhe tokën e Sulltanit, në atë krahinë, e administronte pashai. Se nga ajo ditë ajo tokë ishte e pashait, dhe kush punonte aty punonte për të, dhe i paguante atij, dhe i përgjigjej atij.</w:t>
+      </w:r>
+    </w:p>
+    <w:p>
+      <w:r>
+        <w:t>Kur mbaroi, për një çast askush nuk foli.</w:t>
+      </w:r>
+    </w:p>
+    <w:p>
+      <w:r>
+        <w:t>Pastaj folën të gjithë njëherësh.</w:t>
+      </w:r>
+    </w:p>
+    <w:p>
+      <w:r>
+        <w:t>«Është e jona!»</w:t>
+      </w:r>
+    </w:p>
+    <w:p>
+      <w:r>
+        <w:t>«E kemi gërmuar me duar!»</w:t>
+      </w:r>
+    </w:p>
+    <w:p>
+      <w:r>
+        <w:t>«Tri vjet! Tri vjet në baltë!»</w:t>
+      </w:r>
+    </w:p>
+    <w:p>
+      <w:r>
+        <w:t>Zeneli ngriti shkopin. Fshati heshti.</w:t>
+      </w:r>
+    </w:p>
+    <w:p>
+      <w:r>
+        <w:t>«Ajo tokë», tha plaku, ngadalë, «ishte kënetë që kur është bota. Asnjë sulltan nuk e ka dashur kurrë. Asnjë pasha. Askush. E kanë bërë djemtë tanë, me duart e tyre, në tri vjet. Këshilli ua dha atyre që e bënë. Kështu ka qenë gjithmonë.»</w:t>
+      </w:r>
+    </w:p>
+    <w:p>
+      <w:r>
+        <w:t>«Gjithmonë», tha Selimi, «nuk është tapi.»</w:t>
+      </w:r>
+    </w:p>
+    <w:p>
+      <w:r>
+        <w:t>«Dhe fleta jote është tapi?»</w:t>
+      </w:r>
+    </w:p>
+    <w:p>
+      <w:r>
+        <w:t>«Fleta ime ka vulë.» Selimi e mbështolli fletën me kujdes. «Dhe pas vulës janë njëzet pushkë. Dhe pas njëzet pushkëve janë dy mijë.»</w:t>
+      </w:r>
+    </w:p>
+    <w:p>
+      <w:r>
+        <w:t>Zeneli nuk u përgjigj. Askush nuk u përgjigj.</w:t>
+      </w:r>
+    </w:p>
+    <w:p>
+      <w:r>
+        <w:t>Selimi e la heshtjen të zgjaste. Pastaj buzëqeshi përsëri. Ishte një buzëqeshje e sjellshme, e duruar, buzëqeshja e një njeriu të arsyeshëm.</w:t>
+      </w:r>
+    </w:p>
+    <w:p>
+      <w:r>
+        <w:t>«Por pashai është bujar», tha. «Pashai nuk do gjakun e askujt. Pashai i njeh zakonet tuaja dhe i respekton.» U kthye nga vigani, që kishte mbetur mbi kalë. «Kur dy palë grinden për një tokë, te ju, nuk bëhet luftë. Secili dërgon burrin e tij më të mirë. Luftojnë ata të dy, para të gjithëve. Kush fiton, fiton për të gjithë.»</w:t>
+      </w:r>
+    </w:p>
+    <w:p>
+      <w:r>
+        <w:t>U kthye përsëri nga fshati.</w:t>
+      </w:r>
+    </w:p>
+    <w:p>
+      <w:r>
+        <w:t>«Ky është Kara Ömeri. Është njeriu i pashait. Ju dërgoni tuajin. Po të fitojë i juaji, pashai e gris këtë fletë para syve tuaj, dhe nuk do të dëgjoni më për të. Po të fitojë i tiji, toka është e pashait, dhe askush prej jush nuk do të ketë më ç'të thotë. Pa luftë. Pa gjak. Siç e duan zakonet tuaja.»</w:t>
+      </w:r>
+    </w:p>
+    <w:p>
+      <w:pPr>
+        <w:spacing w:before="200" w:after="200"/>
+        <w:ind w:firstLine="0"/>
+        <w:jc w:val="center"/>
+      </w:pPr>
+      <w:r>
+        <w:rPr>
+          <w:b w:val="0"/>
+          <w:i w:val="0"/>
+          <w:sz w:val="22"/>
+        </w:rPr>
+        <w:t>*   *   *</w:t>
+      </w:r>
+    </w:p>
+    <w:p>
+      <w:pPr>
+        <w:ind w:firstLine="0"/>
+      </w:pPr>
+      <w:r>
+        <w:t>Fshati shikoi Kara Ömerin.</w:t>
+      </w:r>
+    </w:p>
+    <w:p>
+      <w:r>
+        <w:t>Vigani zbriti nga kali. Preku tokën me një zhurmë të mbytur, dhe balta u spërkat rreth çizmeve të tij. Ishte më i gjatë se të gjithë burrat e pranishëm me gjithë kokën, dhe dyfish më i gjerë. Kishte në brez një kordhë që për një burrë tjetër do të ishte shpatë me dy duar.</w:t>
+      </w:r>
+    </w:p>
+    <w:p>
+      <w:r>
+        <w:t>Nuk shikonte askënd. Shikonte përtokë, me krahët të kryqëzuar, sikur të donte të ishte diku tjetër.</w:t>
+      </w:r>
+    </w:p>
+    <w:p>
+      <w:r>
+        <w:t>«Burri ynë më i mirë», tha Zeneli, ngadalë. «Dhe kush e zgjedh?»</w:t>
+      </w:r>
+    </w:p>
+    <w:p>
+      <w:r>
+        <w:t>«E keni zgjedhur ju tashmë», tha Selimi.</w:t>
+      </w:r>
+    </w:p>
+    <w:p>
+      <w:r>
+        <w:t>Hapi kutinë prej kadifeje jeshile. Nuk nxori dylbinë. Nxori fletoren. E hapi dhe shfletoi faqet, me qetësi, derisa gjeti atë që kërkonte.</w:t>
+      </w:r>
+    </w:p>
+    <w:p>
+      <w:r>
+        <w:t>«Këtë verë, nën këtë vidh», tha, «pyeta kush ishte më i forti i Leshtejit. Ma thatë të gjithë bashkë. Pleqtë, burrat, madje edhe një çunak me një dhi.» Ngriti sytë nga fletorja. «Halili.»</w:t>
+      </w:r>
+    </w:p>
+    <w:p>
+      <w:r>
+        <w:t>Heshtja u bë tjetër gjë. U bë e ftohtë, si uji i kroit në dimër.</w:t>
+      </w:r>
+    </w:p>
+    <w:p>
+      <w:r>
+        <w:t>«Halili nuk mundet», tha Zeneli. I dridhej zëri. «E di. E dinë të gjithë. Halili...»</w:t>
+      </w:r>
+    </w:p>
+    <w:p>
+      <w:r>
+        <w:t>«Halili është burri juaj më i mirë. Ma thatë ju.» Selimi e mbylli fletoren. «Pashai do një duel të drejtë. Kundër më të mirit. Jo kundër të dytit, apo të tretit, apo të parit që qëllon. Kundër atij që zgjodhët ju.»</w:t>
+      </w:r>
+    </w:p>
+    <w:p>
+      <w:r>
+        <w:t>«Është turp!» bërtiti dikush nga turma.</w:t>
+      </w:r>
+    </w:p>
+    <w:p>
+      <w:r>
+        <w:t>«Është vrasje!»</w:t>
+      </w:r>
+    </w:p>
+    <w:p>
+      <w:r>
+        <w:t>Ramadani doli përpara, duke çaluar. Kishte fytyrën të kuqe, dhe në qafë shaminë e kuqe të kohës kur ishte djalë.</w:t>
+      </w:r>
+    </w:p>
+    <w:p>
+      <w:r>
+        <w:t>«Shkoj unë», tha. «Kam qenë në Rymnik dhe në Izmail. Shkoj unë.»</w:t>
+      </w:r>
+    </w:p>
+    <w:p>
+      <w:r>
+        <w:t>Selimi e shikoi. Shikoi këmbën.</w:t>
+      </w:r>
+    </w:p>
+    <w:p>
+      <w:r>
+        <w:t>«Jo.»</w:t>
+      </w:r>
+    </w:p>
+    <w:p>
+      <w:r>
+        <w:t>Bajrami doli përpara pranë Ramadanit.</w:t>
+      </w:r>
+    </w:p>
+    <w:p>
+      <w:r>
+        <w:t>«Atëherë unë. Jam i vëllai. Jam më i ri. Jam...»</w:t>
+      </w:r>
+    </w:p>
+    <w:p>
+      <w:r>
+        <w:t>«Jo.»</w:t>
+      </w:r>
+    </w:p>
+    <w:p>
+      <w:r>
+        <w:t>«Po sikur t'i themi jo gjithçkaje?» pyeti Zeneli. «Po sikur të mos dërgojmë njeri?»</w:t>
+      </w:r>
+    </w:p>
+    <w:p>
+      <w:r>
+        <w:t>Selimi ngriti supet.</w:t>
+      </w:r>
+    </w:p>
+    <w:p>
+      <w:r>
+        <w:t>«Atëherë toka është e pashait pa duel. Dhe do të kthehem me më shumë se njëzet pushkë, për ta marrë.»</w:t>
+      </w:r>
+    </w:p>
+    <w:p>
+      <w:pPr>
+        <w:spacing w:before="200" w:after="200"/>
+        <w:ind w:firstLine="0"/>
+        <w:jc w:val="center"/>
+      </w:pPr>
+      <w:r>
+        <w:rPr>
+          <w:b w:val="0"/>
+          <w:i w:val="0"/>
+          <w:sz w:val="22"/>
+        </w:rPr>
+        <w:t>*   *   *</w:t>
+      </w:r>
+    </w:p>
+    <w:p>
+      <w:pPr>
+        <w:ind w:firstLine="0"/>
+      </w:pPr>
+      <w:r>
+        <w:t>Halili arriti në atë çast.</w:t>
+      </w:r>
+    </w:p>
+    <w:p>
+      <w:r>
+        <w:t>Kishte qenë në arë, poshtë në fushë, kur kishin kaluar kalorësit. I kishte parë të ngjiteshin drejt fshatit dhe i kishte ndjekur në këmbë, pa vrapuar. Balta i arrinte te gjunjët. Kishte pelerinën të hedhur mbi supe, dhe nën pelerinë mënga e djathtë e këmishës, bosh nga kyçi e poshtë, ishte e përveshur dhe e lidhur me spango.</w:t>
+      </w:r>
+    </w:p>
+    <w:p>
+      <w:r>
+        <w:t>Turma u hap para tij pa ia kërkuar njeri.</w:t>
+      </w:r>
+    </w:p>
+    <w:p>
+      <w:r>
+        <w:t>Selimi e pa të vinte. Për herë të parë që kur kishte zbritur nga kali, buzëqeshja iu ndal. Vetëm për një çast. Pastaj u kthye.</w:t>
+      </w:r>
+    </w:p>
+    <w:p>
+      <w:r>
+        <w:t>Halili u ndal para tij. Nuk tha asgjë. E shikoi.</w:t>
+      </w:r>
+    </w:p>
+    <w:p>
+      <w:r>
+        <w:t>Selimi e mbajti shikimin. Ishte mësuar t'i mbante shikimet. Por kishte diçka në sytë e atij njeriu që nuk e priste. Nuk kishte zemërim. Nuk kishte urrejtje. Nuk kishte frikë. Kishte tjetër gjë, që Selimi nuk arrinte ta lexonte, dhe Selimi lexonte gjithçka.</w:t>
+      </w:r>
+    </w:p>
+    <w:p>
+      <w:r>
+        <w:t>«Ti ishe tregtari», tha Halili.</w:t>
+      </w:r>
+    </w:p>
+    <w:p>
+      <w:r>
+        <w:t>«Blija vaj.»</w:t>
+      </w:r>
+    </w:p>
+    <w:p>
+      <w:r>
+        <w:t>«E di çfarë blije.»</w:t>
+      </w:r>
+    </w:p>
+    <w:p>
+      <w:r>
+        <w:t>Selimi nuk u përgjigj.</w:t>
+      </w:r>
+    </w:p>
+    <w:p>
+      <w:r>
+        <w:t>Halili u kthye. Shikoi Kara Ömerin. Vigani ngriti sytë nga toka dhe e shikoi edhe ai. Shikoi mëngën bosh, të lidhur me spango. Diçka i kaloi në fytyrë, shpejt, si një re mbi diell.</w:t>
+      </w:r>
+    </w:p>
+    <w:p>
+      <w:r>
+        <w:t>«Unë nuk luftoj me një sakat», tha Kara Ömeri. Kishte zë të thellë, me theksin e Anadollit. Ia tha Selimit, jo Halilit.</w:t>
+      </w:r>
+    </w:p>
+    <w:p>
+      <w:r>
+        <w:t>«Do të luftosh me atë që të them unë», tha Selimi, pa u kthyer.</w:t>
+      </w:r>
+    </w:p>
+    <w:p>
+      <w:r>
+        <w:t>Halili e shikoi Kara Ömerin edhe një çast. Pastaj shikoi Selimin.</w:t>
+      </w:r>
+    </w:p>
+    <w:p>
+      <w:r>
+        <w:t>«Kur?» pyeti.</w:t>
+      </w:r>
+    </w:p>
+    <w:p>
+      <w:r>
+        <w:t>Fshati mbajti frymën. Hatixheja, mes grave, me barkun e stërmadh nën shall, mbylli sytë.</w:t>
+      </w:r>
+    </w:p>
+    <w:p>
+      <w:r>
+        <w:t>«Të premten që vjen», tha Selimi. «Pas namazit. Këtu, nën vidh. Para të gjithëve.»</w:t>
+      </w:r>
+    </w:p>
+    <w:p>
+      <w:r>
+        <w:t>«Pranoj.»</w:t>
+      </w:r>
+    </w:p>
+    <w:p>
+      <w:r>
+        <w:t>Një grua bërtiti. Zeneli u ngrit në këmbë, me shkopin, dhe pastaj u ul përsëri, sepse këmbët nuk e mbanin. Bajrami e kapi të vëllanë për krahun e majtë.</w:t>
+      </w:r>
+    </w:p>
+    <w:p>
+      <w:r>
+        <w:t>«Je i çmendur», i tha me dhëmbë të shtrënguar. «Halil. Je i çmendur. Të vret.»</w:t>
+      </w:r>
+    </w:p>
+    <w:p>
+      <w:r>
+        <w:t>Halili ia hoqi dorën nga krahu, me butësi.</w:t>
+      </w:r>
+    </w:p>
+    <w:p>
+      <w:r>
+        <w:t>«E premte», përsëriti.</w:t>
+      </w:r>
+    </w:p>
+    <w:p>
+      <w:r>
+        <w:t>Pastaj u kthye dhe iku drejt shtëpisë, në këmbë, në baltë, me pelerinën mbi supe dhe mëngën bosh që lëkundej.</w:t>
+      </w:r>
+    </w:p>
+    <w:p>
+      <w:pPr>
+        <w:spacing w:before="200" w:after="200"/>
+        <w:ind w:firstLine="0"/>
+        <w:jc w:val="center"/>
+      </w:pPr>
+      <w:r>
+        <w:rPr>
+          <w:b w:val="0"/>
+          <w:i w:val="0"/>
+          <w:sz w:val="22"/>
+        </w:rPr>
+        <w:t>*   *   *</w:t>
+      </w:r>
+    </w:p>
+    <w:p>
+      <w:pPr>
+        <w:ind w:firstLine="0"/>
+      </w:pPr>
+      <w:r>
+        <w:t>Selimi e shikoi të ikte derisa u zhduk mes shtëpive.</w:t>
+      </w:r>
+    </w:p>
+    <w:p>
+      <w:r>
+        <w:t>Pastaj u kthye nga Kara Ömeri. Vigani po e ngulte sytë mbi të.</w:t>
+      </w:r>
+    </w:p>
+    <w:p>
+      <w:r>
+        <w:t>«Ti e dije», tha Kara Ömeri. Nuk ishte pyetje.</w:t>
+      </w:r>
+    </w:p>
+    <w:p>
+      <w:r>
+        <w:t>«Çfarë dija?»</w:t>
+      </w:r>
+    </w:p>
+    <w:p>
+      <w:r>
+        <w:t>«Dorën.»</w:t>
+      </w:r>
+    </w:p>
+    <w:p>
+      <w:r>
+        <w:t>Selimi rregulloi kaftanin.</w:t>
+      </w:r>
+    </w:p>
+    <w:p>
+      <w:r>
+        <w:t>«Të gjithë e dinin për dorën. U fol në gjithë fushën.»</w:t>
+      </w:r>
+    </w:p>
+    <w:p>
+      <w:r>
+        <w:t>Kara Ömeri vazhdoi ta shikonte, gjatë, me sytë e tij të zinj nën vetullat e dendura. Pastaj pështyu përtokë, në baltë, një pëllëmbë larg çizmeve të Selimit.</w:t>
+      </w:r>
+    </w:p>
+    <w:p>
+      <w:r>
+        <w:t>U hipi përsëri kalit pa thënë tjetër.</w:t>
+      </w:r>
+    </w:p>
+    <w:p>
+      <w:r>
+        <w:t>Në fund të sheshit, ulur mbi gurin e tij, një plak i thatë dhe i kërrusur, me mjekrën e bardhë të përcëlluar në maja, i kishte ndjekur të gjitha pa thënë asnjë fjalë. Tani shikonte rrugën ku ishte zhdukur Halili.</w:t>
+      </w:r>
+    </w:p>
+    <w:p>
+      <w:r>
+        <w:t>Buzëqeshte.</w:t>
+      </w:r>
+    </w:p>
+    <w:p>
+      <w:pPr>
+        <w:sectPr>
+          <w:pgSz w:w="8391" w:h="11906"/>
+          <w:pgMar w:top="1134" w:right="1020" w:bottom="1134" w:left="1020" w:header="720" w:footer="720" w:gutter="0"/>
+          <w:cols w:space="720"/>
+          <w:docGrid w:linePitch="360"/>
+        </w:sectPr>
+      </w:pPr>
+    </w:p>
+    <w:p>
+      <w:pPr>
+        <w:spacing w:before="1200" w:after="80"/>
+        <w:ind w:firstLine="0"/>
+        <w:jc w:val="center"/>
+      </w:pPr>
+      <w:r>
+        <w:rPr>
+          <w:b w:val="0"/>
+          <w:i w:val="0"/>
+          <w:sz w:val="24"/>
+        </w:rPr>
+        <w:t>14</w:t>
+      </w:r>
+    </w:p>
+    <w:p>
+      <w:pPr>
+        <w:spacing w:before="0" w:after="600"/>
+        <w:ind w:firstLine="0"/>
+        <w:jc w:val="center"/>
+      </w:pPr>
+      <w:r>
+        <w:rPr>
+          <w:b/>
+          <w:i w:val="0"/>
+          <w:sz w:val="32"/>
+        </w:rPr>
+        <w:t>Sallak</w:t>
+      </w:r>
+    </w:p>
+    <w:p>
+      <w:pPr>
+        <w:ind w:firstLine="0"/>
+      </w:pPr>
+      <w:r>
+        <w:t>E premtja erdhi e kthjellët dhe e ftohtë, me një erë veriu që e pastronte qiellin.</w:t>
+      </w:r>
+    </w:p>
+    <w:p>
+      <w:r>
+        <w:t>Pas namazit askush nuk u kthye në shtëpi. Gjithë fshati mbeti në shesh, nën vidh, dhe nga gjithë fusha vinin njerëz të tjerë: nga Helmësi, nga Kavaja, nga fshatrat përreth. Lajmi kishte bërë xhiron e pazareve brenda një jave. Pashai kundër Leshtejit. Vigani i Konjës kundër sakatit. Vinin të shihnin siç shkohet të shohësh një varje: pa dëshirë, dhe pa mundur të rrish larg.</w:t>
+      </w:r>
+    </w:p>
+    <w:p>
+      <w:r>
+        <w:t>Ushtarët e pashait kishin bërë një rreth të gjerë në shesh, me litarë dhe hunj, dhe rrinin përreth me pushkë. Nga njëra anë Selim Efendiu, ulur mbi një stol që e kishte bërë t'ia sillnin, me kaftanin e errët dhe kutinë prej kadifeje jeshile mbi gjunjë. Nga ana tjetër pleqtë e këshillit, mbi gurët e tyre. Rreth e qark, turma.</w:t>
+      </w:r>
+    </w:p>
+    <w:p>
+      <w:r>
+        <w:t>Kara Ömeri ishte tashmë në rreth. Kishte hequr pelerinën dhe kaftanin, dhe rrinte lakuriq nga brezi e lart në të ftohtë, me lëkurën që i nxirrte avull. Mbante kordhën në dorë, me majën përtokë. Nuk ngrohej. Nuk lëvizte. Shikonte rrugën.</w:t>
+      </w:r>
+    </w:p>
+    <w:p>
+      <w:r>
+        <w:t>Halili erdhi nga ajo rrugë, në këmbë, me Hatixhenë nga njëra anë dhe të atin nga tjetra.</w:t>
+      </w:r>
+    </w:p>
+    <w:p>
+      <w:pPr>
+        <w:spacing w:before="200" w:after="200"/>
+        <w:ind w:firstLine="0"/>
+        <w:jc w:val="center"/>
+      </w:pPr>
+      <w:r>
+        <w:rPr>
+          <w:b w:val="0"/>
+          <w:i w:val="0"/>
+          <w:sz w:val="22"/>
+        </w:rPr>
+        <w:t>*   *   *</w:t>
+      </w:r>
+    </w:p>
+    <w:p>
+      <w:pPr>
+        <w:ind w:firstLine="0"/>
+      </w:pPr>
+      <w:r>
+        <w:t>Kishte një shpatë në ije.</w:t>
+      </w:r>
+    </w:p>
+    <w:p>
+      <w:r>
+        <w:t>Askush nuk e kishte parë kurrë. Ishte një teh i drejtë, i gjatë, i hollë, me dorezë të thjeshtë prej hekuri të zi dhe mill prej lëkure të re. E kishte farkëtuar Zylo, atë dimër, natën, në dyqanin e tij, me Bajramin te kaceku. Plaku nuk e rrihte më hekurin prej vitesh. Për atë shpatë e kishte rrahur gjashtë javë.</w:t>
+      </w:r>
+    </w:p>
+    <w:p>
+      <w:r>
+        <w:t>Njerëzit e shikuan, dhe pastaj e shikuan më mirë, dhe shtynë njëri-tjetrin me bërryl.</w:t>
+      </w:r>
+    </w:p>
+    <w:p>
+      <w:r>
+        <w:t>Milli ishte varur në ijen e djathtë.</w:t>
+      </w:r>
+    </w:p>
+    <w:p>
+      <w:r>
+        <w:t>Së prapthi nga si e mbanin të gjithë. Së prapthi nga si e mbanin ushtarët e pashait, dhe Kara Ömeri, dhe çdo burrë me shpatë që ishte parë ndonjëherë në Leshtej. Dikush qeshi, ngadalë. I shkreti Halil. Pa të djathtën nuk di më as ku ta vërë shpatën.</w:t>
+      </w:r>
+    </w:p>
+    <w:p>
+      <w:r>
+        <w:t>Hatixheja u ndal në buzë të rrethit. Kishte barkun aq të madh sa mbante kurrizin me duar. Shikoi burrin e saj.</w:t>
+      </w:r>
+    </w:p>
+    <w:p>
+      <w:r>
+        <w:t>Nuk tha asgjë. Nuk kishte nevojë.</w:t>
+      </w:r>
+    </w:p>
+    <w:p>
+      <w:r>
+        <w:t>Rexhepi i vuri një dorë mbi sup, mbi të majtin, dhe e mbajti aty një çast. Pastaj e hoqi.</w:t>
+      </w:r>
+    </w:p>
+    <w:p>
+      <w:r>
+        <w:t>Halili hyri në rreth.</w:t>
+      </w:r>
+    </w:p>
+    <w:p>
+      <w:pPr>
+        <w:spacing w:before="200" w:after="200"/>
+        <w:ind w:firstLine="0"/>
+        <w:jc w:val="center"/>
+      </w:pPr>
+      <w:r>
+        <w:rPr>
+          <w:b w:val="0"/>
+          <w:i w:val="0"/>
+          <w:sz w:val="22"/>
+        </w:rPr>
+        <w:t>*   *   *</w:t>
+      </w:r>
+    </w:p>
+    <w:p>
+      <w:pPr>
+        <w:ind w:firstLine="0"/>
+      </w:pPr>
+      <w:r>
+        <w:t>Kara Ömeri e pa të vinte përpara.</w:t>
+      </w:r>
+    </w:p>
+    <w:p>
+      <w:r>
+        <w:t>Shikoi mëngën bosh, të lidhur me spango. Shikoi shpatën e varur në ijen e gabuar. Shikoi fytyrën e Halilit, të qetë, gati të zhytur në mendime, si të një njeriu që mendon diçka tjetër.</w:t>
+      </w:r>
+    </w:p>
+    <w:p>
+      <w:r>
+        <w:t>Pastaj shikoi Selimin, dhe në sytë e tij kishte diçka që i ngjante turpit.</w:t>
+      </w:r>
+    </w:p>
+    <w:p>
+      <w:r>
+        <w:t>«Dorëzohu», i tha Halilit, me zë të ulët, që ta dëgjonte vetëm ai. «Thuaj që heq dorë. Askush nuk do të të quajë frikacak. Jo me atë krah.»</w:t>
+      </w:r>
+    </w:p>
+    <w:p>
+      <w:r>
+        <w:t>«Jo», tha Halili.</w:t>
+      </w:r>
+    </w:p>
+    <w:p>
+      <w:r>
+        <w:t>«Nuk dua të vras një sakat.»</w:t>
+      </w:r>
+    </w:p>
+    <w:p>
+      <w:r>
+        <w:t>«Atëherë mos e bëj.»</w:t>
+      </w:r>
+    </w:p>
+    <w:p>
+      <w:r>
+        <w:t>Kara Ömeri shtrëngoi nofullën.</w:t>
+      </w:r>
+    </w:p>
+    <w:p>
+      <w:r>
+        <w:t>Selimi u ngrit nga stoli.</w:t>
+      </w:r>
+    </w:p>
+    <w:p>
+      <w:r>
+        <w:t>«Filloni», tha.</w:t>
+      </w:r>
+    </w:p>
+    <w:p>
+      <w:pPr>
+        <w:spacing w:before="200" w:after="200"/>
+        <w:ind w:firstLine="0"/>
+        <w:jc w:val="center"/>
+      </w:pPr>
+      <w:r>
+        <w:rPr>
+          <w:b w:val="0"/>
+          <w:i w:val="0"/>
+          <w:sz w:val="22"/>
+        </w:rPr>
+        <w:t>*   *   *</w:t>
+      </w:r>
+    </w:p>
+    <w:p>
+      <w:pPr>
+        <w:ind w:firstLine="0"/>
+      </w:pPr>
+      <w:r>
+        <w:t>Halili e çoi dorën e majtë te doreza. E nxori shpatën nga milli me një lëvizje të vetme, të gjatë, të pastër, siç nxirret një kovë nga uji. Tehu doli tërthor para trupit dhe u ndal, drejt, i drejtuar nga Kara Ömeri.</w:t>
+      </w:r>
+    </w:p>
+    <w:p>
+      <w:r>
+        <w:t>Në dorën e majtë.</w:t>
+      </w:r>
+    </w:p>
+    <w:p>
+      <w:r>
+        <w:t>Vigani buzëqeshi. Ishte një buzëqeshje e trishtë. Një burrë me një dorë të vetme, që mban shpatën me atë që i ka mbetur. Me dorën e dobët. Me dorën që nuk e ka përdorur kurrë.</w:t>
+      </w:r>
+    </w:p>
+    <w:p>
+      <w:r>
+        <w:t>Sulmoi.</w:t>
+      </w:r>
+    </w:p>
+    <w:p>
+      <w:r>
+        <w:t>Sulmoi me peshë, nga lart, me një goditje që do të çante një trung. Për të mbaruar shpejt. Për të mos i bërë më shumë dhimbje se ç'duhej.</w:t>
+      </w:r>
+    </w:p>
+    <w:p>
+      <w:r>
+        <w:t>Shpata e Halilit nuk ishte aty kur arriti kordha.</w:t>
+      </w:r>
+    </w:p>
+    <w:p>
+      <w:r>
+        <w:t>Nuk e priti goditjen. E la të kalonte. U zhvendos gjysmë hapi, anash, butë, dhe kordha e Kara Ömerit preu ajrin aty ku një çast më parë ishte koka e tij dhe u ngul në baltë. Dhe ndërsa vigani humbiste ekuilibrin përpara, i tërhequr nga pesha e vet, tehu i hollë i Halilit i kaloi pranë qafës, aq afër sa ia preu mjekrën.</w:t>
+      </w:r>
+    </w:p>
+    <w:p>
+      <w:r>
+        <w:t>Një tufë qimesh të zeza ra mbi baltë.</w:t>
+      </w:r>
+    </w:p>
+    <w:p>
+      <w:r>
+        <w:t>Kara Ömeri u drejtua me vrull. E çoi dorën te qafa. Shikoi tufën përtokë. Shikoi Halilin.</w:t>
+      </w:r>
+    </w:p>
+    <w:p>
+      <w:r>
+        <w:t>Nuk buzëqeshte më.</w:t>
+      </w:r>
+    </w:p>
+    <w:p>
+      <w:pPr>
+        <w:spacing w:before="200" w:after="200"/>
+        <w:ind w:firstLine="0"/>
+        <w:jc w:val="center"/>
+      </w:pPr>
+      <w:r>
+        <w:rPr>
+          <w:b w:val="0"/>
+          <w:i w:val="0"/>
+          <w:sz w:val="22"/>
+        </w:rPr>
+        <w:t>*   *   *</w:t>
+      </w:r>
+    </w:p>
+    <w:p>
+      <w:pPr>
+        <w:ind w:firstLine="0"/>
+      </w:pPr>
+      <w:r>
+        <w:t>Sheshi ishte bërë memec.</w:t>
+      </w:r>
+    </w:p>
+    <w:p>
+      <w:r>
+        <w:t>Nuk dëgjohej asgjë. As era, as qentë, as frymëmarrja e një mijë njerëzve. Vetëm shushurima e degëve të vidhit, lart, dhe zhurma e dy tehëve.</w:t>
+      </w:r>
+    </w:p>
+    <w:p>
+      <w:r>
+        <w:t>Kara Ömeri sulmoi përsëri. Jo më me peshë. Me mjeshtëri, kësaj radhe, me kujdes, siç kishte bërë në njëmbëdhjetë duele: goditje të shpejta, finta, sulme. Ishte i zoti. Ishte shumë i zoti. Ishte më i miri që pashai kishte mundur të gjente në gjithë Anadollin dhe Shqipërinë bashkë.</w:t>
+      </w:r>
+    </w:p>
+    <w:p>
+      <w:r>
+        <w:t>Halili priste. Të gjitha goditjet. Pa nxitim, pa mundim, siç largohen mizat. Dhe herë pas here, mes një pritjeje dhe tjetrës, tehu i tij i hollë arrinte nga një anë ku nuk duhej të arrinte, nga një kënd që Kara Ömeri nuk e kishte parë kurrë në jetën e tij, nga ajo anë e trupit që asnjë kundërshtar nuk e kishte sulmuar kurrë sepse asnjë kundërshtar nuk mund ta sulmonte. Një prerje mbi sup. Një mbi parakrah. Një mbi ije. Jo të thella. Të sakta. Si firma.</w:t>
+      </w:r>
+    </w:p>
+    <w:p>
+      <w:r>
+        <w:t>Ishte si të luftoje kundër një pasqyre. Gjithçka së prapthi. Gjithçka nga ana tjetër.</w:t>
+      </w:r>
+    </w:p>
+    <w:p>
+      <w:r>
+        <w:t>Në turmë, një burrë i çalë me një shami të kuqe në qafë filloi të qeshë, ngadalë, me lot në sy.</w:t>
+      </w:r>
+    </w:p>
+    <w:p>
+      <w:r>
+        <w:t>«Tymi», thoshte me vete. «Tymi. Ç'tym i thua.»</w:t>
+      </w:r>
+    </w:p>
+    <w:p>
+      <w:r>
+        <w:t>Pranë tij një plak i thatë dhe i kërrusur, me mjekrën të përcëlluar, e shikonte duelin me sytë e kuq nga zjarri. Lëvizte buzët. Thoshte një fjalë të vetme, ngadalë, gjithmonë të njëjtën, si një lutje.</w:t>
+      </w:r>
+    </w:p>
+    <w:p>
+      <w:r>
+        <w:t>Pastaj e tha më fort.</w:t>
+      </w:r>
+    </w:p>
+    <w:p>
+      <w:r>
+        <w:t>«Sallak.»</w:t>
+      </w:r>
+    </w:p>
+    <w:p>
+      <w:r>
+        <w:t>Ata që i rrinin përreth u kthyen.</w:t>
+      </w:r>
+    </w:p>
+    <w:p>
+      <w:r>
+        <w:t>«Sallak», përsëriti Zylo, dhe kësaj radhe e tha me zë të lartë, me gjithë zërin që kishte, dhe zëri i një farkëtari plak që për gjashtëdhjetë vjet kishte bërtitur mbi zhurmën e çekiçit ishte ende i fortë. «Sallak! Është sallak! Ka qenë gjithmonë sallak!»</w:t>
+      </w:r>
+    </w:p>
+    <w:p>
+      <w:r>
+        <w:t>Fjala vrapoi nëpër turmë si zjarri në kashtë.</w:t>
+      </w:r>
+    </w:p>
+    <w:p>
+      <w:r>
+        <w:rPr>
+          <w:i/>
+        </w:rPr>
+        <w:t>Sallak.</w:t>
+      </w:r>
+      <w:r>
+        <w:t xml:space="preserve"> Mëngjarash. Ai që përdor dorën e majtë. Ai që i bën të gjitha së prapthi.</w:t>
+      </w:r>
+    </w:p>
+    <w:p>
+      <w:r>
+        <w:t>Pleqtë u panë. Dikujt iu kujtuan gjëra që i kishte harruar. Gjyshi i Halilit, që e mbante thikën në një mënyrë të çuditshme. Fatimeja, në sofër, me lugën. Djali në dyqanin e Zylos që e rrihte hekurin me një ritëm të tijin.</w:t>
+      </w:r>
+    </w:p>
+    <w:p>
+      <w:r>
+        <w:t>«Sallak!» bërtiti dikush.</w:t>
+      </w:r>
+    </w:p>
+    <w:p>
+      <w:r>
+        <w:t>«Sallak!» bërtiti një tjetër.</w:t>
+      </w:r>
+    </w:p>
+    <w:p>
+      <w:r>
+        <w:t xml:space="preserve">Dhe nga ana tjetër e rrethit, mes ushtarëve të pashait, dikush bërtiste një fjalë tjetër, turqisht. E bërtisnin duke qeshur, në fillim, duke treguar mëngën bosh të Halilit. </w:t>
+      </w:r>
+      <w:r>
+        <w:rPr>
+          <w:i/>
+        </w:rPr>
+        <w:t>Çolak.</w:t>
+      </w:r>
+      <w:r>
+        <w:t xml:space="preserve"> Sakati. Ai me një krah. Pastaj pushuan së qeshuri, dhe e bërtisnin prapë, por ndryshe. Të habitur. Gati të trembur.</w:t>
+      </w:r>
+    </w:p>
+    <w:p>
+      <w:r>
+        <w:rPr>
+          <w:i/>
+        </w:rPr>
+        <w:t>Çolak. Çolak.</w:t>
+      </w:r>
+    </w:p>
+    <w:p>
+      <w:r>
+        <w:t>Të dyja fjalët u përzien mbi shesh, turqishtja dhe shqipja, sakati dhe mëngjarashi, derisa nuk ishte më e mundur t'i dalloje.</w:t>
+      </w:r>
+    </w:p>
+    <w:p>
+      <w:pPr>
+        <w:spacing w:before="200" w:after="200"/>
+        <w:ind w:firstLine="0"/>
+        <w:jc w:val="center"/>
+      </w:pPr>
+      <w:r>
+        <w:rPr>
+          <w:b w:val="0"/>
+          <w:i w:val="0"/>
+          <w:sz w:val="22"/>
+        </w:rPr>
+        <w:t>*   *   *</w:t>
+      </w:r>
+    </w:p>
+    <w:p>
+      <w:pPr>
+        <w:ind w:firstLine="0"/>
+      </w:pPr>
+      <w:r>
+        <w:t>Kara Ömeri ishte i lodhur.</w:t>
+      </w:r>
+    </w:p>
+    <w:p>
+      <w:r>
+        <w:t>I rridhte gjak nga gjashtë prerje, asnjëra prej të cilave nuk do ta vriste, por të gjitha bashkë po e zbraznin. Merrte frymë me gojë hapur, me një zhurmë të ngjirur. Kordha i rëndonte si spirancë. Përballë tij, Halili merrte frymë sikur të ishte duke shëtitur.</w:t>
+      </w:r>
+    </w:p>
+    <w:p>
+      <w:r>
+        <w:t>Vigani e kuptoi se nuk mund të fitonte me teh.</w:t>
+      </w:r>
+    </w:p>
+    <w:p>
+      <w:r>
+        <w:t>Atëherë bëri të vetmen gjë që i kishte mbetur. E hodhi kordhën, u ul dhe u hodh përpara me gjithë peshën e tij, kokulur, si në mundje. Si një dem.</w:t>
+      </w:r>
+    </w:p>
+    <w:p>
+      <w:r>
+        <w:t>Halili nuk e priste. Kara Ömeri e kapi plotësisht, në mes, dhe e ngriti nga toka, dhe e përplasi në baltë me një zhurmë që turma e ndjeu në stomak. Shpata e hollë fluturoi larg. Vigani iu vu përsipër. I kapi kyçin e majtë me një dorë të madhe si lopatë dhe ia shtypi në baltë, dhe me dorën tjetër, të mbyllur grusht, të ngritur, u bë gati të godiste.</w:t>
+      </w:r>
+    </w:p>
+    <w:p>
+      <w:r>
+        <w:t>Hatixheja bërtiti.</w:t>
+      </w:r>
+    </w:p>
+    <w:p>
+      <w:r>
+        <w:t>Halili nuk e kishte më shpatën. Nuk e kishte dorën e djathtë. E kishte kyçin e majtë të gozhduar në baltë nën peshën e një vigani.</w:t>
+      </w:r>
+    </w:p>
+    <w:p>
+      <w:r>
+        <w:t>Kishte cungun.</w:t>
+      </w:r>
+    </w:p>
+    <w:p>
+      <w:r>
+        <w:t>E ngriti, me vrull, dhe e goditi Kara Ömerin në mes të fytyrës, mbi hundë, me kockën e kyçit që Zylo e kishte qepur dhe djegur. Hunda u thye me një zhurmë të thatë. Vigani bërtiti, dhe për një çast, vetëm një çast, dora që shtrëngonte kyçin e majtë u hap.</w:t>
+      </w:r>
+    </w:p>
+    <w:p>
+      <w:r>
+        <w:t>Një çast mjaftonte.</w:t>
+      </w:r>
+    </w:p>
+    <w:p>
+      <w:r>
+        <w:t>Dora e majtë e Halilit shkoi te brezi që mbante në mes. Doli me diçka që shkëlqente. Një teh i gjatë sa një dorë, pak i lakuar, me dorezë prej briri të errët të konsumuar nga përdorimi.</w:t>
+      </w:r>
+    </w:p>
+    <w:p>
+      <w:r>
+        <w:t>Thika e gjyshit. E mprehur nga ana e gabuar.</w:t>
+      </w:r>
+    </w:p>
+    <w:p>
+      <w:r>
+        <w:t>Nga ana e duhur, për të.</w:t>
+      </w:r>
+    </w:p>
+    <w:p>
+      <w:r>
+        <w:t>Një çast më vonë Kara Ömeri ishte i palëvizur, i gjunjëzuar në baltë, me duart hapur dhe kokën të hedhur prapa. Nën mjekrën e zezë, mbi fyt, shtypte tehu i thikës. Një fije gjaku, vetëm një, i zbriste nëpër qafë.</w:t>
+      </w:r>
+    </w:p>
+    <w:p>
+      <w:r>
+        <w:t>Halili ishte në këmbë pas tij. Balta i rridhte nga flokët. Merrte frymë fort, tani.</w:t>
+      </w:r>
+    </w:p>
+    <w:p>
+      <w:r>
+        <w:t>Në shesh nuk pipëtinte asgjë.</w:t>
+      </w:r>
+    </w:p>
+    <w:p>
+      <w:pPr>
+        <w:spacing w:before="200" w:after="200"/>
+        <w:ind w:firstLine="0"/>
+        <w:jc w:val="center"/>
+      </w:pPr>
+      <w:r>
+        <w:rPr>
+          <w:b w:val="0"/>
+          <w:i w:val="0"/>
+          <w:sz w:val="22"/>
+        </w:rPr>
+        <w:t>*   *   *</w:t>
+      </w:r>
+    </w:p>
+    <w:p>
+      <w:pPr>
+        <w:ind w:firstLine="0"/>
+      </w:pPr>
+      <w:r>
+        <w:t>«Vrite», tha dikush në turmë.</w:t>
+      </w:r>
+    </w:p>
+    <w:p>
+      <w:r>
+        <w:t>«Vrite!»</w:t>
+      </w:r>
+    </w:p>
+    <w:p>
+      <w:r>
+        <w:t>Halili shikoi Selimin.</w:t>
+      </w:r>
+    </w:p>
+    <w:p>
+      <w:r>
+        <w:t>Selim Efendiu ishte në këmbë para stolit. Ishte i bardhë si çarçaf. Mbante ende në dorë kutinë prej kadifeje jeshile, dhe gishtat e shtrëngonin aq fort sa nyjet ishin zverdhur.</w:t>
+      </w:r>
+    </w:p>
+    <w:p>
+      <w:r>
+        <w:t>«Pa gjak», tha Halili. Nuk bërtiste. E dëgjuan të gjithë njësoj. «E thatë ju. Pa luftë. Pa gjak. Siç i duan zakonet tona.»</w:t>
+      </w:r>
+    </w:p>
+    <w:p>
+      <w:r>
+        <w:t>E hoqi thikën nga fyti i Kara Ömerit.</w:t>
+      </w:r>
+    </w:p>
+    <w:p>
+      <w:r>
+        <w:t>Vigani mbeti i gjunjëzuar. E çoi dorën te fyti, shikoi gjakun mbi gishta. Pastaj ngriti sytë nga Halili. Dhe bëri një gjë që askush, as në Leshtej as në oborrin e pashait, nuk e kishte parë ta bënte ndonjëherë.</w:t>
+      </w:r>
+    </w:p>
+    <w:p>
+      <w:r>
+        <w:t>Uli kokën.</w:t>
+      </w:r>
+    </w:p>
+    <w:p>
+      <w:r>
+        <w:t>«Sallak», tha ngadalë, me theksin e tij të Anadollit. Pastaj, turqisht: «Çolak.» Pastaj qeshi, me hundën të thyer dhe gjakun në gojë, një të qeshur të ulët e të lodhur. «Zoti më është dëshmitar. Nuk kam parë kurrë diçka të tillë.»</w:t>
+      </w:r>
+    </w:p>
+    <w:p>
+      <w:r>
+        <w:t>U ngrit, me mundim. Mori kordhën nga balta. E shikoi. Pastaj shkoi drejt Selimit, ngadalë, duke përshkuar rrethin, dhe ia hodhi para këmbëve.</w:t>
+      </w:r>
+    </w:p>
+    <w:p>
+      <w:r>
+        <w:t>«Çoja ti pashait», tha. «Unë mbarova.»</w:t>
+      </w:r>
+    </w:p>
+    <w:p>
+      <w:r>
+        <w:t>Dhe iku, në këmbë, drejt rrugës së fushës, duke rrjedhur gjak, pa u kthyer.</w:t>
+      </w:r>
+    </w:p>
+    <w:p>
+      <w:pPr>
+        <w:spacing w:before="200" w:after="200"/>
+        <w:ind w:firstLine="0"/>
+        <w:jc w:val="center"/>
+      </w:pPr>
+      <w:r>
+        <w:rPr>
+          <w:b w:val="0"/>
+          <w:i w:val="0"/>
+          <w:sz w:val="22"/>
+        </w:rPr>
+        <w:t>*   *   *</w:t>
+      </w:r>
+    </w:p>
+    <w:p>
+      <w:pPr>
+        <w:ind w:firstLine="0"/>
+      </w:pPr>
+      <w:r>
+        <w:t>Halili shkoi drejt Selimit.</w:t>
+      </w:r>
+    </w:p>
+    <w:p>
+      <w:r>
+        <w:t>Ushtarët e pashait u panë me njëri-tjetrin. Askush nuk ngriti pushkën. Askush nuk lëvizi. E kishin parë duelin edhe ata.</w:t>
+      </w:r>
+    </w:p>
+    <w:p>
+      <w:r>
+        <w:t>U ndal para shkruesit. Ishte më i gjatë se ai me gjithë kokën. Kishte baltë në fytyrë, thikën e gjyshit ende në dorë.</w:t>
+      </w:r>
+    </w:p>
+    <w:p>
+      <w:r>
+        <w:t>«Fletën», tha.</w:t>
+      </w:r>
+    </w:p>
+    <w:p>
+      <w:r>
+        <w:t>Selimi nxori fletën me vulën e dyllit të kuq. I dridheshin duart. Ia zgjati.</w:t>
+      </w:r>
+    </w:p>
+    <w:p>
+      <w:r>
+        <w:t>Halili nuk e mori. Priti.</w:t>
+      </w:r>
+    </w:p>
+    <w:p>
+      <w:r>
+        <w:t>Selimi e kuptoi. E grisi në dysh, para të gjithëve. Pastaj në katër. Copat ranë në baltë, pranë kordhës së Kara Ömerit.</w:t>
+      </w:r>
+    </w:p>
+    <w:p>
+      <w:r>
+        <w:t>«Thuaji pashait tënd», tha Halili, «që toka e Leshtejit ka tashmë zot. Shumë zotër. Ata që e gërmuan.»</w:t>
+      </w:r>
+    </w:p>
+    <w:p>
+      <w:r>
+        <w:t>Selimi pohoi me kokë.</w:t>
+      </w:r>
+    </w:p>
+    <w:p>
+      <w:r>
+        <w:t>Halili u përkul drejt tij, aq afër sa askush tjetër nuk mund ta dëgjonte.</w:t>
+      </w:r>
+    </w:p>
+    <w:p>
+      <w:r>
+        <w:t>«Dhe thuaji njeriut me shtizë», tha ngadalë, «që gaboi dorë.»</w:t>
+      </w:r>
+    </w:p>
+    <w:p>
+      <w:pPr>
+        <w:spacing w:before="200" w:after="200"/>
+        <w:ind w:firstLine="0"/>
+        <w:jc w:val="center"/>
+      </w:pPr>
+      <w:r>
+        <w:rPr>
+          <w:b w:val="0"/>
+          <w:i w:val="0"/>
+          <w:sz w:val="22"/>
+        </w:rPr>
+        <w:t>*   *   *</w:t>
+      </w:r>
+    </w:p>
+    <w:p>
+      <w:pPr>
+        <w:ind w:firstLine="0"/>
+      </w:pPr>
+      <w:r>
+        <w:t>Më vonë, kur ushtarët e pashait kishin ikur dhe sheshi ishte mbushur me britma dhe përqafime dhe muzikë, Halili kërkoi Zylon.</w:t>
+      </w:r>
+    </w:p>
+    <w:p>
+      <w:r>
+        <w:t>E gjeti ulur mbi gurin e tij, nën vidh, vetëm, me duart mbi gjunjë. Plaku dukej shumë i lodhur. Dukej i lumtur.</w:t>
+      </w:r>
+    </w:p>
+    <w:p>
+      <w:r>
+        <w:t>Halili u ul pranë tij.</w:t>
+      </w:r>
+    </w:p>
+    <w:p>
+      <w:r>
+        <w:t>Ndenjën kështu gjatë, duke parë fshatin që festonte.</w:t>
+      </w:r>
+    </w:p>
+    <w:p>
+      <w:r>
+        <w:t>«Atë natë», tha në fund Halili. «Në dyqan. Para zjarrit. Më the një gjë.»</w:t>
+      </w:r>
+    </w:p>
+    <w:p>
+      <w:r>
+        <w:t>«E mbaj mend.»</w:t>
+      </w:r>
+    </w:p>
+    <w:p>
+      <w:r>
+        <w:t>«Ma thua përsëri?»</w:t>
+      </w:r>
+    </w:p>
+    <w:p>
+      <w:r>
+        <w:t>Zylo ktheu nga ai sytë e tij të kuq nga zjarri.</w:t>
+      </w:r>
+    </w:p>
+    <w:p>
+      <w:r>
+        <w:t>Atë natë, me thikën në dorë dhe hekurin që bëhej i bardhë në farkë, ishte përkulur mbi veshin e djalit që e kishte parë të rritej dhe i kishte thënë të vetmet fjalë që mund të vlenin për diçka. I përsëriti tani, njësoj, ngadalë.</w:t>
+      </w:r>
+    </w:p>
+    <w:p>
+      <w:r>
+        <w:t>«Tani askush nuk do të të thotë më cilën dorë të përdorësh.»</w:t>
+      </w:r>
+    </w:p>
+    <w:p>
+      <w:pPr>
+        <w:spacing w:before="200" w:after="200"/>
+        <w:ind w:firstLine="0"/>
+        <w:jc w:val="center"/>
+      </w:pPr>
+      <w:r>
+        <w:rPr>
+          <w:b w:val="0"/>
+          <w:i w:val="0"/>
+          <w:sz w:val="22"/>
+        </w:rPr>
+        <w:t>*   *   *</w:t>
+      </w:r>
+    </w:p>
+    <w:p>
+      <w:pPr>
+        <w:ind w:firstLine="0"/>
+      </w:pPr>
+      <w:r>
+        <w:t>Që nga ajo ditë njerëzit e fushës filluan ta thërrasin fshatin ndryshe.</w:t>
+      </w:r>
+    </w:p>
+    <w:p>
+      <w:r>
+        <w:t xml:space="preserve">Jo menjëherë. Ngadalë, siç ndodh me emrat. Në pazarin e Kavajës, nëpër tavernat e Durrësit, nëpër rrugë. Fshati i </w:t>
+      </w:r>
+      <w:r>
+        <w:rPr>
+          <w:i/>
+        </w:rPr>
+        <w:t>sallakut</w:t>
+      </w:r>
+      <w:r>
+        <w:t xml:space="preserve">. Fshati i </w:t>
+      </w:r>
+      <w:r>
+        <w:rPr>
+          <w:i/>
+        </w:rPr>
+        <w:t>çolakut</w:t>
+      </w:r>
+      <w:r>
+        <w:t>. I mëngjarashit, i sakatit. I mëngjarashit sakat. Të dyja fjalët u konsumuan njëra pas tjetrës, duke kaluar gojë më gojë, derisa mbeti vetëm një.</w:t>
+      </w:r>
+    </w:p>
+    <w:p>
+      <w:r>
+        <w:t>Çollak.</w:t>
+      </w:r>
+    </w:p>
+    <w:p>
+      <w:pPr>
+        <w:sectPr>
+          <w:pgSz w:w="8391" w:h="11906"/>
+          <w:pgMar w:top="1134" w:right="1020" w:bottom="1134" w:left="1020" w:header="720" w:footer="720" w:gutter="0"/>
+          <w:cols w:space="720"/>
+          <w:docGrid w:linePitch="360"/>
+        </w:sectPr>
+      </w:pPr>
+    </w:p>
+    <w:p>
+      <w:pPr>
+        <w:spacing w:before="1200" w:after="80"/>
+        <w:ind w:firstLine="0"/>
+        <w:jc w:val="center"/>
+      </w:pPr>
+      <w:r>
+        <w:rPr>
+          <w:b w:val="0"/>
+          <w:i w:val="0"/>
+          <w:sz w:val="24"/>
+        </w:rPr>
+        <w:t>15</w:t>
+      </w:r>
+    </w:p>
+    <w:p>
+      <w:pPr>
+        <w:spacing w:before="0" w:after="600"/>
+        <w:ind w:firstLine="0"/>
+        <w:jc w:val="center"/>
+      </w:pPr>
+      <w:r>
+        <w:rPr>
+          <w:b/>
+          <w:i w:val="0"/>
+          <w:sz w:val="32"/>
+        </w:rPr>
+        <w:t>Behu</w:t>
+      </w:r>
+    </w:p>
+    <w:p>
+      <w:pPr>
+        <w:ind w:firstLine="0"/>
+      </w:pPr>
+      <w:r>
+        <w:t>Murati lindi nëntë ditë pas duelit, në agim, me erën e veriut që përplasej te kanatat.</w:t>
+      </w:r>
+    </w:p>
+    <w:p>
+      <w:r>
+        <w:t>Lindi me nxitim, sikur të nxitonte ta shihte botën. Mamia e Helmësit arriti kur gjithçka kishte mbaruar dhe gjeti Fatimenë me foshnjën në krahë, të mbështjellë me një batanije, dhe Hatixhenë që qeshte e qante në shtrat. Halili, jashtë derës, në këmbë në lëmë gjithë natën, dëgjoi britmën e parë dhe iu desh të mbështetej te mani.</w:t>
+      </w:r>
+    </w:p>
+    <w:p>
+      <w:r>
+        <w:t>Kur e lanë të hynte, e ëma ia vuri foshnjën në krahë, dhe ai e mbajti siç kishte mësuar t'i mbante të gjitha atë dimër: me krahun e djathtë si djep dhe me dorën që i kishte mbetur nën kokë.</w:t>
+      </w:r>
+    </w:p>
+    <w:p>
+      <w:r>
+        <w:t>Ishte e vogël, e kuqe, e zemëruar. Kishte kokën plot me flokë të zeza dhe dy grushte të shtrënguara. Halili e shikoi gjatë pa thënë asgjë.</w:t>
+      </w:r>
+    </w:p>
+    <w:p>
+      <w:r>
+        <w:t>Pastaj foshnja hapi njërin nga grushtet dhe i kapi një gisht. E shtrëngoi fort.</w:t>
+      </w:r>
+    </w:p>
+    <w:p>
+      <w:r>
+        <w:t>Hatixheja, nga shtrati, shikoi cilën dorë kishte hapur foshnja. Shikoi Halilin. Halili shikoi atë.</w:t>
+      </w:r>
+    </w:p>
+    <w:p>
+      <w:r>
+        <w:t>Asnjëri nuk tha asgjë. Hatixheja filloi të qeshë, me shpinën e dorës mbi gojë.</w:t>
+      </w:r>
+    </w:p>
+    <w:p>
+      <w:pPr>
+        <w:spacing w:before="200" w:after="200"/>
+        <w:ind w:firstLine="0"/>
+        <w:jc w:val="center"/>
+      </w:pPr>
+      <w:r>
+        <w:rPr>
+          <w:b w:val="0"/>
+          <w:i w:val="0"/>
+          <w:sz w:val="22"/>
+        </w:rPr>
+        <w:t>*   *   *</w:t>
+      </w:r>
+    </w:p>
+    <w:p>
+      <w:pPr>
+        <w:ind w:firstLine="0"/>
+      </w:pPr>
+      <w:r>
+        <w:t>Historia e duelit bëri xhiron e Shqipërisë para se të mbaronte pranvera.</w:t>
+      </w:r>
+    </w:p>
+    <w:p>
+      <w:r>
+        <w:t>Arriti në Kavajë të nesërmen, në Durrës pas tri ditësh, në Tiranë dhe në Elbasan brenda një jave. E tregonin nëpër pazare e taverna, dhe çdo herë pak më ndryshe. Kara Ömeri u bë i gjatë sa një minare, pastaj sa një mal. Halili e kishte mundur me një dorë, pastaj pa duar, pastaj me dhëmbë. Dikush bëri një këngë, që këndohej me lahutë nëpër shtëpitë e fushës, dhe që tregonte për një burrë të Leshtejit që kishte humbur dorën e djathtë dhe kishte fituar me të majtën, dhe për një pasha që kishte mbetur me një fletë të grisur në dorë.</w:t>
+      </w:r>
+    </w:p>
+    <w:p>
+      <w:r>
+        <w:t>Pashai nuk dërgoi më njeri.</w:t>
+      </w:r>
+    </w:p>
+    <w:p>
+      <w:r>
+        <w:t>Por historia shkoi më larg. Shkoi përtej maleve, përtej Maqedonisë, përtej Thrakës. Arriti në Stamboll, te Porta, ku një sulltan i quajtur edhe ai Selim po përpiqej në çdo mënyrë t'i frenonte pashallarët e krahinave që silleshin si mbretër. Dhe Sulltanit, thoshin, historia e një fshatari shqiptar që kishte poshtëruar një pasha pa derdhur asnjë pikë gjaku i kishte pëlqyer shumë.</w:t>
+      </w:r>
+    </w:p>
+    <w:p>
+      <w:pPr>
+        <w:spacing w:before="200" w:after="200"/>
+        <w:ind w:firstLine="0"/>
+        <w:jc w:val="center"/>
+      </w:pPr>
+      <w:r>
+        <w:rPr>
+          <w:b w:val="0"/>
+          <w:i w:val="0"/>
+          <w:sz w:val="22"/>
+        </w:rPr>
+        <w:t>*   *   *</w:t>
+      </w:r>
+    </w:p>
+    <w:p>
+      <w:pPr>
+        <w:ind w:firstLine="0"/>
+      </w:pPr>
+      <w:r>
+        <w:t>Lajmëtari erdhi në gusht, gjatë shirjes.</w:t>
+      </w:r>
+    </w:p>
+    <w:p>
+      <w:r>
+        <w:t>Ishte një çaush i Portës, një burrë në moshë të mesme, i trashë, i djersitur, mbi një mushkë më të lodhur se ai. Kishte një çallmë të bardhë të pluhurosur dhe një çantë lëkure me disa fletë të mbështjella, të lidhura me shirita të kuq e të gjelbër. Vinte nga Stambolli. I ishin dashur dy muaj. Kishte dhimbje kurrizi, dhimbje këmbësh dhe dhimbje të gjithçkaje, dhe kishte ende shtatë fshatra për të bërë para se të mund të kthehej në shtëpi.</w:t>
+      </w:r>
+    </w:p>
+    <w:p>
+      <w:r>
+        <w:t>U ndal te shtëpia e parë që gjeti në hyrje të Leshtejit.</w:t>
+      </w:r>
+    </w:p>
+    <w:p>
+      <w:r>
+        <w:t>Ishte shtëpia e Shabanit.</w:t>
+      </w:r>
+    </w:p>
+    <w:p>
+      <w:r>
+        <w:t>Shabani ishte ulur nën pjergullën e tij, në hije, duke pirë duhan. Pa mushkën, pa çallmën, pa shiritat e kuq e të gjelbër që dilnin nga çanta. U ngrit sikur ta kishte pickuar një grerëz.</w:t>
+      </w:r>
+    </w:p>
+    <w:p>
+      <w:r>
+        <w:t>«Mirë se erdhe! Mirë se erdhe, vëlla! Ulu! Kafe? Raki? Pak ujë të ftohtë?»</w:t>
+      </w:r>
+    </w:p>
+    <w:p>
+      <w:r>
+        <w:t>Çaushi u lëshua mbi stol. Piu ujin. Piu kafen. Piu rakinë. Pastaj nxori një regjistër nga çanta, e hapi dhe fryu.</w:t>
+      </w:r>
+    </w:p>
+    <w:p>
+      <w:r>
+        <w:t>«Kërkoj dy burra», tha. «Nga ky fshat. Leshtej, në kazanë e Kavajës.» Ndoqi rreshtat me gisht, duke ngushtuar sytë. «Halil, i biri i Rexhepit. Dhe Ramadan, i biri i Shabanit. Veteranë të Izmailit. Sulltani, në madhështinë e tij, u jep një titull.»</w:t>
+      </w:r>
+    </w:p>
+    <w:p>
+      <w:r>
+        <w:t>Shabani mbeti i palëvizur.</w:t>
+      </w:r>
+    </w:p>
+    <w:p>
+      <w:r>
+        <w:t>«Një titull», përsëriti.</w:t>
+      </w:r>
+    </w:p>
+    <w:p>
+      <w:r>
+        <w:t xml:space="preserve">«Dy tituj. Nga një secilit.» Çaushi u gogësit. «Atij që ka më shumë tokë i shkon </w:t>
+      </w:r>
+      <w:r>
+        <w:rPr>
+          <w:i/>
+        </w:rPr>
+        <w:t>behu</w:t>
+      </w:r>
+      <w:r>
+        <w:t xml:space="preserve">. Është titull i tokës, për atë që ka shumë. Tjetrit i shkon </w:t>
+      </w:r>
+      <w:r>
+        <w:rPr>
+          <w:i/>
+        </w:rPr>
+        <w:t>aga</w:t>
+      </w:r>
+      <w:r>
+        <w:t>.» Mbylli regjistrin. «Ku i gjej? Nxitoj. Kam edhe shtatë fshatra.»</w:t>
+      </w:r>
+    </w:p>
+    <w:p>
+      <w:r>
+        <w:t>Shabani e shikoi. Shikoi regjistrin. Shikoi, përtej murit, arat e fushës, dhe gurin e kufirit që prej disa vitesh lëvizte vetëm gjysmë pëllëmbe.</w:t>
+      </w:r>
+    </w:p>
+    <w:p>
+      <w:r>
+        <w:t>U ul përsëri. Hodhi edhe një raki. Hodhi edhe një për çaushin.</w:t>
+      </w:r>
+    </w:p>
+    <w:p>
+      <w:r>
+        <w:t>«Vëlla», tha, me zërin më të ëmbël që kishte pasur në jetën e tij. «Ti je i lodhur. Ke bërë rrugë të gjatë. Ke edhe shtatë fshatra.»</w:t>
+      </w:r>
+    </w:p>
+    <w:p>
+      <w:r>
+        <w:t>«Tetë, ndoshta.»</w:t>
+      </w:r>
+    </w:p>
+    <w:p>
+      <w:r>
+        <w:t>«Tetë! Zoti të ndihmoftë.» Shabani tundi kokën. «Halili është poshtë në mulli, një orë rrugë. Ramadani është djali im: është në fushë, një orë tjetër. Do të shkosh t'i kërkosh të dy, me këtë vapë, me atë mushkë?»</w:t>
+      </w:r>
+    </w:p>
+    <w:p>
+      <w:r>
+        <w:t>Çaushi shikoi mushkën. Mushka shikoi çaushin.</w:t>
+      </w:r>
+    </w:p>
+    <w:p>
+      <w:r>
+        <w:t>«Unë dhe Halili», vazhdoi Shabani, «jemi si vëllezër. Më shumë se vëllezër. Arat tona preken. Familjet tona hanë bashkë prej pesëdhjetë vjetësh. Kur u kthye nga lufta qava më shumë se i ati. Pyet kë të duash.» Vuri dorën mbi zemër. «Lëri fletët tek unë. Ia çoj unë sonte, me gjithë nderimet. Ti shkruaj në regjistër që u bë, dhe nisu i freskët.»</w:t>
+      </w:r>
+    </w:p>
+    <w:p>
+      <w:r>
+        <w:t>Çaushi hezitoi. Pastaj shikoi rakinë, dhe pjergullën, dhe hijen, dhe rrugën e bardhë nën diell.</w:t>
+      </w:r>
+    </w:p>
+    <w:p>
+      <w:r>
+        <w:t>«Titulli duhet shkruar drejt», tha. «Në regjistër. Behu atij që ka më shumë tokë.»</w:t>
+      </w:r>
+    </w:p>
+    <w:p>
+      <w:r>
+        <w:t>«Sigurisht, sigurisht.» Shabani u përkul mbi regjistër, me pamje serioze. Shikoi rreshtat. Kërciti gjuhën. «Ah. Ja. E sheh? Në Stamboll gabojnë gjithmonë. Këtu kanë shkruar që ai me më shumë tokë është Halili.»</w:t>
+      </w:r>
+    </w:p>
+    <w:p>
+      <w:r>
+        <w:t>«Nuk është kështu?»</w:t>
+      </w:r>
+    </w:p>
+    <w:p>
+      <w:r>
+        <w:t>Shabani hapi krahët, me një shprehje durimi të pafund.</w:t>
+      </w:r>
+    </w:p>
+    <w:p>
+      <w:r>
+        <w:t>«Vëlla. Eja këtu. Shiko.» E kapi për krahu, e çoi te muri, i tregoi fushën. «E sheh atë arë të madhe, atje poshtë, të zezë, me gurin e kufirit? E kujt mendon se është?»</w:t>
+      </w:r>
+    </w:p>
+    <w:p>
+      <w:r>
+        <w:t>Çaushi shikoi arën. Ishte e madhe. Ishte e zezë. Kishte një gur.</w:t>
+      </w:r>
+    </w:p>
+    <w:p>
+      <w:r>
+        <w:t>«E djalit tënd?»</w:t>
+      </w:r>
+    </w:p>
+    <w:p>
+      <w:r>
+        <w:t>Shabani nuk tha as po as jo. Vetëm buzëqeshi, me sytë gjysmë të mbyllur, dhe i hodhi edhe një raki.</w:t>
+      </w:r>
+    </w:p>
+    <w:p>
+      <w:r>
+        <w:t>Çaushi u kthye te stoli. Hapi regjistrin. Mori penën. Fshiu dy fjalë dhe shkroi dy të tjera, sipër, me shkrimin e shtrembër të atij që ka pirë tri raki në mesditë gushti.</w:t>
+      </w:r>
+    </w:p>
+    <w:p>
+      <w:r>
+        <w:t xml:space="preserve">Ramadan, i biri i Shabanit: </w:t>
+      </w:r>
+      <w:r>
+        <w:rPr>
+          <w:i/>
+        </w:rPr>
+        <w:t>behu</w:t>
+      </w:r>
+      <w:r>
+        <w:t>.</w:t>
+      </w:r>
+    </w:p>
+    <w:p>
+      <w:r>
+        <w:t xml:space="preserve">Halil, i biri i Rexhepit: </w:t>
+      </w:r>
+      <w:r>
+        <w:rPr>
+          <w:i/>
+        </w:rPr>
+        <w:t>aga</w:t>
+      </w:r>
+      <w:r>
+        <w:t>.</w:t>
+      </w:r>
+    </w:p>
+    <w:p>
+      <w:r>
+        <w:t>Pastaj i la të dy fletët me shiritat e kuq e të gjelbër mbi stolin e Shabanit, piu një gllënjkë të fundit, i hipi mushkës dhe iku drejt fshatit tjetër, i kënaqur, pa u kthyer.</w:t>
+      </w:r>
+    </w:p>
+    <w:p>
+      <w:pPr>
+        <w:spacing w:before="200" w:after="200"/>
+        <w:ind w:firstLine="0"/>
+        <w:jc w:val="center"/>
+      </w:pPr>
+      <w:r>
+        <w:rPr>
+          <w:b w:val="0"/>
+          <w:i w:val="0"/>
+          <w:sz w:val="22"/>
+        </w:rPr>
+        <w:t>*   *   *</w:t>
+      </w:r>
+    </w:p>
+    <w:p>
+      <w:pPr>
+        <w:ind w:firstLine="0"/>
+      </w:pPr>
+      <w:r>
+        <w:t>Bajrami e mori vesh po atë mbrëmje, dhe arriti në lëmin e të vëllait me fytyrën të nxirë.</w:t>
+      </w:r>
+    </w:p>
+    <w:p>
+      <w:r>
+        <w:t>«Ta vodhi titullin! Shabani! Ta vodhi titullin! Lajmëtari i Sulltanit! Titulli i tokës ishte yti, dhe ai e bëri t'ia shkruante Ramadanit! E di gjithë fshati! E tregon vetë nën vidh, duke qeshur!»</w:t>
+      </w:r>
+    </w:p>
+    <w:p>
+      <w:r>
+        <w:t>Halili ishte ulur nën man, me Muratin në krahë. Foshnja flinte.</w:t>
+      </w:r>
+    </w:p>
+    <w:p>
+      <w:r>
+        <w:t>E shikoi të vëllanë. Pastaj shikoi përtej murit, drejt shtëpisë së Shabanit, prej nga vinte, e sjellë nga era e mbrëmjes, një e qeshur që dëgjohej para se të shihje kush e bënte.</w:t>
+      </w:r>
+    </w:p>
+    <w:p>
+      <w:r>
+        <w:t>Dhe Halili filloi të qeshë.</w:t>
+      </w:r>
+    </w:p>
+    <w:p>
+      <w:r>
+        <w:t>Qeshi ngadalë, në fillim, për të mos e zgjuar foshnjën. Pastaj nuk mundi më ta mbante. Qeshi fort, me kokën prapa, me lot në sy, siç nuk kishte qeshur që nga ditët e luftës, siç ndoshta nuk kishte qeshur kurrë në jetën e tij. Murati u zgjua dhe filloi të qajë. Hatixheja doli nga shtëpia të shihte çfarë po ndodhte, dhe duke parë të shoqin filloi të qeshë edhe ajo, pa ditur pse.</w:t>
+      </w:r>
+    </w:p>
+    <w:p>
+      <w:r>
+        <w:t>Bajrami i shikonte të dy siç shikohen dy të çmendur.</w:t>
+      </w:r>
+    </w:p>
+    <w:p>
+      <w:r>
+        <w:t>«Qesh? Ta vodhën titullin dhe ti qesh?»</w:t>
+      </w:r>
+    </w:p>
+    <w:p>
+      <w:r>
+        <w:t>«Kuajt», tha Halili, kur arriti të fliste. «Nëntë ditë. Një pasdite që zgjati nëntë ditë. Guri. Një pëllëmbë në vit.» Fshiu sytë me shpinën e dorës. «Dhe tani titulli. Bajram. Si të mos qeshësh?»</w:t>
+      </w:r>
+    </w:p>
+    <w:p>
+      <w:pPr>
+        <w:spacing w:before="200" w:after="200"/>
+        <w:ind w:firstLine="0"/>
+        <w:jc w:val="center"/>
+      </w:pPr>
+      <w:r>
+        <w:rPr>
+          <w:b w:val="0"/>
+          <w:i w:val="0"/>
+          <w:sz w:val="22"/>
+        </w:rPr>
+        <w:t>*   *   *</w:t>
+      </w:r>
+    </w:p>
+    <w:p>
+      <w:pPr>
+        <w:ind w:firstLine="0"/>
+      </w:pPr>
+      <w:r>
+        <w:t>Ramadani erdhi të nesërmen.</w:t>
+      </w:r>
+    </w:p>
+    <w:p>
+      <w:r>
+        <w:t>Erdhi vetëm, duke çaluar, me fletën me shiritat e kuq e të gjelbër në dorë dhe fytyrën e një njeriu që do të donte të ishte nën dhé.</w:t>
+      </w:r>
+    </w:p>
+    <w:p>
+      <w:r>
+        <w:t>«Halil», tha. «Unë nuk dija asgjë. Të betohem. Babai im...»</w:t>
+      </w:r>
+    </w:p>
+    <w:p>
+      <w:r>
+        <w:t>«E di.»</w:t>
+      </w:r>
+    </w:p>
+    <w:p>
+      <w:r>
+        <w:t>«Do t'ia bëj ta ndryshojë. Shkoj në Kavajë. Shkoj në Stamboll, po të duhet. I shkruaj çaushit...»</w:t>
+      </w:r>
+    </w:p>
+    <w:p>
+      <w:r>
+        <w:t>«Jo.»</w:t>
+      </w:r>
+    </w:p>
+    <w:p>
+      <w:r>
+        <w:t>Ramadani e shikoi.</w:t>
+      </w:r>
+    </w:p>
+    <w:p>
+      <w:r>
+        <w:t>«Mbaje», tha Halili. «Ramadan Behu. Tingëllon mirë.» Buzëqeshi. «E ke fituar në Izmail, me atë këmbë. Dhe unë...» Mori fletën e tij, atë me shiritin e gjelbër, nga duart e mikut. E shpalosi. Lexoi fjalën, të shkruar me shkrimin e shtrembër të një çaushi që kishte pirë tri raki. «Unë jam Aga.»</w:t>
+      </w:r>
+    </w:p>
+    <w:p>
+      <w:r>
+        <w:t>«Halil Aga», tha Ramadani, ngadalë, duke provuar tingullin.</w:t>
+      </w:r>
+    </w:p>
+    <w:p>
+      <w:r>
+        <w:t>«Halil Aga.»</w:t>
+      </w:r>
+    </w:p>
+    <w:p>
+      <w:r>
+        <w:t>U panë. Pastaj Ramadani filloi të qeshë edhe ai, dhe Halili me të, dhe qeshën bashkë në lëmë si dy djem që sapo kanë vjedhur fiq nga e njëjta pemë.</w:t>
+      </w:r>
+    </w:p>
+    <w:p>
+      <w:pPr>
+        <w:spacing w:before="200" w:after="200"/>
+        <w:ind w:firstLine="0"/>
+        <w:jc w:val="center"/>
+      </w:pPr>
+      <w:r>
+        <w:rPr>
+          <w:b w:val="0"/>
+          <w:i w:val="0"/>
+          <w:sz w:val="22"/>
+        </w:rPr>
+        <w:t>*   *   *</w:t>
+      </w:r>
+    </w:p>
+    <w:p>
+      <w:pPr>
+        <w:ind w:firstLine="0"/>
+      </w:pPr>
+      <w:r>
+        <w:t>Atë mbrëmje, pas darkës, Rexhepi e thirri të birin nën pjergull.</w:t>
+      </w:r>
+    </w:p>
+    <w:p>
+      <w:r>
+        <w:t>Plaku ishte bërë edhe më i kërrusur, atë verë. Ecte me dy shkopinj. Por kishte sytë të çelët dhe të gëzuar, siç nuk i kishte pasur prej vitesh.</w:t>
+      </w:r>
+    </w:p>
+    <w:p>
+      <w:r>
+        <w:t>«Halil Aga», tha, duke provuar edhe ai tingullin. «Gjyshi yt do të kishte qeshur shumë.»</w:t>
+      </w:r>
+    </w:p>
+    <w:p>
+      <w:r>
+        <w:t>«E di.»</w:t>
+      </w:r>
+    </w:p>
+    <w:p>
+      <w:r>
+        <w:t>«Fëmijët e tu do të quhen kështu. Dhe fëmijët e fëmijëve të tu. Halil Aga. Halilaga.» Tundi kokën, duke buzëqeshur. «Për faj të Shabanit.»</w:t>
+      </w:r>
+    </w:p>
+    <w:p>
+      <w:r>
+        <w:t>«Për meritë të Shabanit.»</w:t>
+      </w:r>
+    </w:p>
+    <w:p>
+      <w:r>
+        <w:t>Rexhepi qeshi, dhe e qeshura i dhembi në kurriz, dhe qeshi prapë.</w:t>
+      </w:r>
+    </w:p>
+    <w:p>
+      <w:r>
+        <w:t>Pastaj Halili u ngrit, hyri në shtëpi dhe u kthye me thikën e gjyshit. E shikoi në dritën e kandilit. Doreza prej briri të errët. Vijat e gjyshit, që askush nuk kishte ditur t'i lexonte kurrë. Të pesat e tij, poshtë.</w:t>
+      </w:r>
+    </w:p>
+    <w:p>
+      <w:r>
+        <w:t>Me majën e një gozhde, ngadalë, gdhendi edhe një. Të fundit.</w:t>
+      </w:r>
+    </w:p>
+    <w:p>
+      <w:r>
+        <w:t>«Për kë është kjo?» pyeti Rexhepi.</w:t>
+      </w:r>
+    </w:p>
+    <w:p>
+      <w:r>
+        <w:t>Halili mendoi.</w:t>
+      </w:r>
+    </w:p>
+    <w:p>
+      <w:r>
+        <w:t>«Për dorën», tha.</w:t>
+      </w:r>
+    </w:p>
+    <w:p>
+      <w:r>
+        <w:t>Pastaj hyri në dhomën ku flinin Hatixheja dhe foshnja. U përkul mbi djepin prej druri që Bajrami e kishte gdhendur për nipin. Murati flinte me grushte të mbyllura, me gojë hapur.</w:t>
+      </w:r>
+    </w:p>
+    <w:p>
+      <w:r>
+        <w:t>Halili e vuri thikën nën jastëkun e djepit. Dorezën prej briri nga ana ku foshnja, duke u zgjuar, do ta zgjaste dorën e parë.</w:t>
+      </w:r>
+    </w:p>
+    <w:p>
+      <w:r>
+        <w:t>Hatixheja, nga shtrati, e shikonte.</w:t>
+      </w:r>
+    </w:p>
+    <w:p>
+      <w:r>
+        <w:t>«Nga cila anë?» pyeti, ngadalë.</w:t>
+      </w:r>
+    </w:p>
+    <w:p>
+      <w:r>
+        <w:t>Halili buzëqeshi në errësirë.</w:t>
+      </w:r>
+    </w:p>
+    <w:p>
+      <w:r>
+        <w:t>«Nga ana e duhur», tha.</w:t>
+      </w:r>
+    </w:p>
+    <w:p>
+      <w:pPr>
+        <w:sectPr>
+          <w:pgSz w:w="8391" w:h="11906"/>
+          <w:pgMar w:top="1134" w:right="1020" w:bottom="1134" w:left="1020" w:header="720" w:footer="720" w:gutter="0"/>
+          <w:cols w:space="720"/>
+          <w:docGrid w:linePitch="360"/>
+        </w:sectPr>
+      </w:pPr>
+    </w:p>
+    <w:p>
+      <w:pPr>
+        <w:spacing w:before="1200" w:after="600"/>
+        <w:ind w:firstLine="0"/>
+        <w:jc w:val="center"/>
+      </w:pPr>
+      <w:r>
+        <w:rPr>
+          <w:b/>
+          <w:i w:val="0"/>
+          <w:sz w:val="32"/>
+        </w:rPr>
+        <w:t>Epilogu</w:t>
+      </w:r>
+    </w:p>
+    <w:p>
+      <w:pPr>
+        <w:ind w:firstLine="0"/>
+      </w:pPr>
+      <w:r>
+        <w:t>Libri që gjetëm nën dysheme nuk i thoshte të gjitha këto.</w:t>
+      </w:r>
+    </w:p>
+    <w:p>
+      <w:r>
+        <w:t>Thoshte shumë më pak. Disa faqe, disa rreshta të fshirë nga uji. Thoshte që Halili ishte nisur për një luftë të largët dhe ishte kthyer. Thoshte që i kishin prerë dorën e djathtë dhe që ai kishte fituar me të majtën. Thoshte që një titull kishte ardhur nga Stambolli dhe që nga një mashtrim, ose nga një shaka, ishte bërë mbiemri ynë. Pjesën tjetër m'u desh ta përfytyroj vetë, rresht pas rreshti, natë pas nate, duke u përpjekur të mos i tradhtoja ato pak fjalë të shkruara me dorë nga dikush që nuk do ta njohim kurrë.</w:t>
+      </w:r>
+    </w:p>
+    <w:p>
+      <w:r>
+        <w:t xml:space="preserve">Por një gjë, libri, e thoshte qartë. Thoshte ç'do të thotë </w:t>
+      </w:r>
+      <w:r>
+        <w:rPr>
+          <w:i/>
+        </w:rPr>
+        <w:t>sallak</w:t>
+      </w:r>
+      <w:r>
+        <w:t>.</w:t>
+      </w:r>
+    </w:p>
+    <w:p>
+      <w:r>
+        <w:t>Mëngjarash.</w:t>
+      </w:r>
+    </w:p>
+    <w:p>
+      <w:r>
+        <w:t>Ai që përdor dorën e majtë. Ai që i bën të gjitha së prapthi.</w:t>
+      </w:r>
+    </w:p>
+    <w:p>
+      <w:pPr>
+        <w:spacing w:before="200" w:after="200"/>
+        <w:ind w:firstLine="0"/>
+        <w:jc w:val="center"/>
+      </w:pPr>
+      <w:r>
+        <w:rPr>
+          <w:b w:val="0"/>
+          <w:i w:val="0"/>
+          <w:sz w:val="22"/>
+        </w:rPr>
+        <w:t>*   *   *</w:t>
+      </w:r>
+    </w:p>
+    <w:p>
+      <w:pPr>
+        <w:ind w:firstLine="0"/>
+      </w:pPr>
+      <w:r>
+        <w:t>E lexova atë fjalë ulur në tryezën e kuzhinës së babait, mbrëmjen që u kthyem nga shtëpia e vjetër. E lexova dhe m'u kujtua gjyshi, zëri i tij i ngjirur, pauzat e tij të gjata. «Halili e kishte dorën sallake.» Asgjë tjetër. Dhe unë që e pyesja ç'donte të thoshte, dhe ai që qeshte dhe ndërronte bisedë.</w:t>
+      </w:r>
+    </w:p>
+    <w:p>
+      <w:r>
+        <w:t>Tani e di pse qeshte.</w:t>
+      </w:r>
+    </w:p>
+    <w:p>
+      <w:r>
+        <w:t>Nuk qeshte me mua. Qeshte sepse historia ishte e gjitha aty, në atë fjalë të vetme, dhe ai e dinte. Një burrë që humb dorën e djathtë dhe fiton me të majtën. Një fshat që merr emrin nga një mëngjarash dhe nga një sakat. Një familje që mban prej më shumë se dyqind vjetësh një titull të vjedhur nga një fqinj dinak. Qeshte sepse disa histori, po t'i shpjegosh, thyhen. Duhet t'i lësh të plota, dhe të presësh që dikush, një ditë, t'i hapë vetë.</w:t>
+      </w:r>
+    </w:p>
+    <w:p>
+      <w:r>
+        <w:t>Gjyshi im priti. I shkroi emrat e tij në fund të pemës, me stilolapsin e tij, dhe e vuri librin përsëri nën dërrasën e dyshemesë. Dhe priti.</w:t>
+      </w:r>
+    </w:p>
+    <w:p>
+      <w:pPr>
+        <w:spacing w:before="200" w:after="200"/>
+        <w:ind w:firstLine="0"/>
+        <w:jc w:val="center"/>
+      </w:pPr>
+      <w:r>
+        <w:rPr>
+          <w:b w:val="0"/>
+          <w:i w:val="0"/>
+          <w:sz w:val="22"/>
+        </w:rPr>
+        <w:t>*   *   *</w:t>
+      </w:r>
+    </w:p>
+    <w:p>
+      <w:pPr>
+        <w:ind w:firstLine="0"/>
+      </w:pPr>
+      <w:r>
+        <w:t>Disa muaj më vonë u ktheva në fshat vetëm.</w:t>
+      </w:r>
+    </w:p>
+    <w:p>
+      <w:r>
+        <w:t xml:space="preserve">E lashë makinën në hyrje, aty ku është tabela me emrin. </w:t>
+      </w:r>
+      <w:r>
+        <w:rPr>
+          <w:i/>
+        </w:rPr>
+        <w:t>Leshtej-Çollakë.</w:t>
+      </w:r>
+      <w:r>
+        <w:t xml:space="preserve"> E kisha lexuar njëqind herë pa e lexuar vërtet. Atë mëngjes u ndala ta shikoja gjatë, siç shikohet fotografia e dikujt që sapo ke zbuluar se e njeh.</w:t>
+      </w:r>
+    </w:p>
+    <w:p>
+      <w:r>
+        <w:t>Pastaj zbrita në këmbë deri te përroi.</w:t>
+      </w:r>
+    </w:p>
+    <w:p>
+      <w:r>
+        <w:t>Këneta nuk ekziston më prej dyqind vjetësh. Tani ka ara, dhe sera, dhe një rrugë të asfaltuar. Mulliri nuk ekziston më. Kallamishtja, përgjatë kanalit, po: kallamat janë të lartë, më të lartë se një burrë, dhe shushurijnë në erë sikur flasin me njëri-tjetrin. Eca mes tyre në perëndim, me diellin në sy, dhe e vura re se po ecja kokulur, dhe e ngrita kokën.</w:t>
+      </w:r>
+    </w:p>
+    <w:p>
+      <w:r>
+        <w:t>U ngjita përsëri në fshat. Ka ende një shesh. Nuk e di nëse është i njëjti. Nuk e di nëse vidhi është i njëjti, apo një bir i tij, apo një nip. U ula mbi një gur, nën degë, dhe ndenja aty gjatë.</w:t>
+      </w:r>
+    </w:p>
+    <w:p>
+      <w:r>
+        <w:t>Një plak, nga ana tjetër e sheshit, më shikonte. Në fund u afrua dhe më pyeti i kujt isha.</w:t>
+      </w:r>
+    </w:p>
+    <w:p>
+      <w:r>
+        <w:t>Ia thashë.</w:t>
+      </w:r>
+    </w:p>
+    <w:p>
+      <w:r>
+        <w:t>Ai pohoi ngadalë me kokë. Më shikoi fytyrën, sikur të kërkonte diçka në të. Pastaj më shikoi duart. Të dyja. Njërën dhe pastaj tjetrën.</w:t>
+      </w:r>
+    </w:p>
+    <w:p>
+      <w:r>
+        <w:t>Dhe buzëqeshi, dhe nuk tha asgjë.</w:t>
+      </w:r>
+    </w:p>
+    <w:p>
+      <w:pPr>
+        <w:spacing w:before="200" w:after="200"/>
+        <w:ind w:firstLine="0"/>
+        <w:jc w:val="center"/>
+      </w:pPr>
+      <w:r>
+        <w:rPr>
+          <w:b w:val="0"/>
+          <w:i w:val="0"/>
+          <w:sz w:val="22"/>
+        </w:rPr>
+        <w:t>*   *   *</w:t>
+      </w:r>
+    </w:p>
+    <w:p>
+      <w:pPr>
+        <w:ind w:firstLine="0"/>
+      </w:pPr>
+      <w:r>
+        <w:t>Kjo është historia e Halilit, i pari i Halilagajve, ashtu siç e përfytyrova unë.</w:t>
+      </w:r>
+    </w:p>
+    <w:p>
+      <w:r>
+        <w:t>Zërat i shpika. Gjestet, të ftohtin, ngjyrën e qiellit në disa mëngjese. Shpika Selim Efendiun me dylbinë e tij, dhe Kara Ömerin me mjekrën e tij, dhe viçin e kuq pesë a gjashtë muajsh. Ndoshta Hatixheja nuk quhej Hatixhe. Ndoshta Shabani nuk e lëvizte gurin e kufirit. Ndoshta gjyshi i Halilit nuk kishte asnjë thikë.</w:t>
+      </w:r>
+    </w:p>
+    <w:p>
+      <w:r>
+        <w:t>Por Halili ka ekzistuar. Është në majë të pemës, me shkrimin më të madh nga të gjithë. Luftën, dorën, duelin, titullin: i thoshte libri.</w:t>
+      </w:r>
+    </w:p>
+    <w:p>
+      <w:r>
+        <w:t>Dhe dora sallake jo. Atë nuk e shpika unë.</w:t>
       </w:r>
     </w:p>
     <w:sectPr>

</xml_diff>